<commit_message>
Agrega README, documentos PDF y sincroniza archivos locales
</commit_message>
<xml_diff>
--- a/DESIGN_Mireille.docx
+++ b/DESIGN_Mireille.docx
@@ -20,33 +20,6 @@
     </w:p>
     <w:p>
       <w:pPr>
-        <w:spacing w:after="60"/>
-      </w:pPr>
-      <w:r>
-        <w:rPr>
-          <w:rFonts w:ascii="Calibri" w:eastAsia="Calibri" w:hAnsi="Calibri" w:cs="Calibri"/>
-          <w:b/>
-          <w:bCs/>
-          <w:color w:val="202225"/>
-          <w:sz w:val="26"/>
-          <w:szCs w:val="26"/>
-        </w:rPr>
-        <w:t>Mireille.R</w:t>
-      </w:r>
-      <w:r>
-        <w:rPr>
-          <w:rFonts w:ascii="Calibri" w:eastAsia="Calibri" w:hAnsi="Calibri" w:cs="Calibri"/>
-          <w:b/>
-          <w:bCs/>
-          <w:color w:val="202225"/>
-          <w:sz w:val="26"/>
-          <w:szCs w:val="26"/>
-        </w:rPr>
-        <w:t>— descripción en lenguaje natural</w:t>
-      </w:r>
-    </w:p>
-    <w:p>
-      <w:pPr>
         <w:pBdr>
           <w:bottom w:val="single" w:sz="12" w:space="6" w:color="E7562E"/>
         </w:pBdr>
@@ -170,6 +143,23 @@
     </w:p>
     <w:p>
       <w:pPr>
+        <w:rPr>
+          <w:rFonts w:ascii="Calibri" w:hAnsi="Calibri" w:cs="Calibri"/>
+          <w:sz w:val="24"/>
+          <w:szCs w:val="24"/>
+        </w:rPr>
+      </w:pPr>
+      <w:r>
+        <w:rPr>
+          <w:rFonts w:ascii="Calibri" w:hAnsi="Calibri" w:cs="Calibri"/>
+          <w:sz w:val="24"/>
+          <w:szCs w:val="24"/>
+        </w:rPr>
+        <w:t>La identidad MSR combina diseño editorial de gran escala, estética nocturna, azules eléctricos, recursos estelares y efectos de iluminación neón. La interfaz prioriza los proyectos mediante fondos oscuros y galerías visuales, con microinteracciones discretas. La apariencia final del index tiene prioridad sobre las descripciones iniciales de fondos blancos y diseño completamente plano.</w:t>
+      </w:r>
+    </w:p>
+    <w:p>
+      <w:pPr>
         <w:pStyle w:val="Ttulo1"/>
         <w:spacing w:before="340" w:after="120"/>
         <w:rPr>
@@ -186,16 +176,7 @@
           <w:bCs/>
           <w:color w:val="202225"/>
         </w:rPr>
-        <w:t>2</w:t>
-      </w:r>
-      <w:r>
-        <w:rPr>
-          <w:rFonts w:ascii="Calibri" w:eastAsia="Calibri" w:hAnsi="Calibri" w:cs="Calibri"/>
-          <w:b/>
-          <w:bCs/>
-          <w:color w:val="202225"/>
-        </w:rPr>
-        <w:t xml:space="preserve"> · Colores</w:t>
+        <w:t>2 · Colores</w:t>
       </w:r>
     </w:p>
     <w:p>
@@ -437,6 +418,7 @@
           <w:sz w:val="24"/>
           <w:szCs w:val="24"/>
         </w:rPr>
+        <w:lastRenderedPageBreak/>
         <w:t xml:space="preserve">Blanco — </w:t>
       </w:r>
       <w:r>
@@ -527,7 +509,6 @@
         <w:rPr>
           <w:rFonts w:ascii="Calibri" w:hAnsi="Calibri" w:cs="Calibri"/>
         </w:rPr>
-        <w:lastRenderedPageBreak/>
         <w:t xml:space="preserve">La combinación principal del sitio debe ser </w:t>
       </w:r>
       <w:r>
@@ -679,6 +660,23 @@
       </w:r>
       <w:r>
         <w:t>.</w:t>
+      </w:r>
+    </w:p>
+    <w:p>
+      <w:pPr>
+        <w:rPr>
+          <w:rFonts w:ascii="Calibri" w:hAnsi="Calibri" w:cs="Calibri"/>
+          <w:sz w:val="24"/>
+          <w:szCs w:val="24"/>
+        </w:rPr>
+      </w:pPr>
+      <w:r>
+        <w:rPr>
+          <w:rFonts w:ascii="Calibri" w:hAnsi="Calibri" w:cs="Calibri"/>
+          <w:sz w:val="24"/>
+          <w:szCs w:val="24"/>
+        </w:rPr>
+        <w:t>Existen además colores aplicados directamente a componentes, especialmente #000B79 en Contacto, #3C66FE en halos y separadores, y #7CB5FB en enlaces. Deben registrarse como acentos complementarios activos, no asumir que toda la interfaz usa exclusivamente los tokens sobrescritos.</w:t>
       </w:r>
     </w:p>
     <w:p>
@@ -699,16 +697,7 @@
           <w:bCs/>
           <w:color w:val="202225"/>
         </w:rPr>
-        <w:t>3</w:t>
-      </w:r>
-      <w:r>
-        <w:rPr>
-          <w:rFonts w:ascii="Calibri" w:eastAsia="Calibri" w:hAnsi="Calibri" w:cs="Calibri"/>
-          <w:b/>
-          <w:bCs/>
-          <w:color w:val="202225"/>
-        </w:rPr>
-        <w:t xml:space="preserve"> · Tipografía</w:t>
+        <w:t>3 · Tipografía</w:t>
       </w:r>
     </w:p>
     <w:p>
@@ -731,13 +720,7 @@
           <w:b w:val="0"/>
           <w:bCs w:val="0"/>
         </w:rPr>
-        <w:t>Arial Black y Arial</w:t>
-      </w:r>
-      <w:r>
-        <w:rPr>
-          <w:rFonts w:ascii="Calibri" w:hAnsi="Calibri" w:cs="Calibri"/>
-        </w:rPr>
-        <w:t xml:space="preserve">, buscando mantener una identidad visual directa, contundente y fácil de leer. </w:t>
+        <w:t>Arial Black</w:t>
       </w:r>
       <w:r>
         <w:rPr>
@@ -746,40 +729,7 @@
           <w:b w:val="0"/>
           <w:bCs w:val="0"/>
         </w:rPr>
-        <w:t>Arial Black</w:t>
-      </w:r>
-      <w:r>
-        <w:rPr>
-          <w:rFonts w:ascii="Calibri" w:hAnsi="Calibri" w:cs="Calibri"/>
-        </w:rPr>
-        <w:t xml:space="preserve"> funciona como la tipografía principal para títulos, encabezados y elementos de alto impacto, mientras que </w:t>
-      </w:r>
-      <w:r>
-        <w:rPr>
-          <w:rStyle w:val="Textoennegrita"/>
-          <w:rFonts w:ascii="Calibri" w:hAnsi="Calibri" w:cs="Calibri"/>
-        </w:rPr>
-        <w:t>Arial</w:t>
-      </w:r>
-      <w:r>
-        <w:rPr>
-          <w:rFonts w:ascii="Calibri" w:hAnsi="Calibri" w:cs="Calibri"/>
-        </w:rPr>
-        <w:t xml:space="preserve"> se utiliza para textos informativos, descripciones, navegación y contenido general. Esta combinación permite conservar el carácter fuerte y gráfico que ya está presente en mi portafolio, especialmente en los grandes títulos de las categorías. portafolio 2026</w:t>
-      </w:r>
-    </w:p>
-    <w:p>
-      <w:pPr>
-        <w:pStyle w:val="NormalWeb"/>
-        <w:rPr>
-          <w:rFonts w:ascii="Calibri" w:hAnsi="Calibri" w:cs="Calibri"/>
-        </w:rPr>
-      </w:pPr>
-      <w:r>
-        <w:rPr>
-          <w:rFonts w:ascii="Calibri" w:hAnsi="Calibri" w:cs="Calibri"/>
-        </w:rPr>
-        <w:t xml:space="preserve">El </w:t>
+        <w:t xml:space="preserve">, </w:t>
       </w:r>
       <w:r>
         <w:rPr>
@@ -788,13 +738,19 @@
           <w:b w:val="0"/>
           <w:bCs w:val="0"/>
         </w:rPr>
-        <w:t>display</w:t>
-      </w:r>
-      <w:r>
-        <w:rPr>
-          <w:rFonts w:ascii="Calibri" w:hAnsi="Calibri" w:cs="Calibri"/>
-        </w:rPr>
-        <w:t xml:space="preserve">, utilizado para los títulos de mayor impacto y palabras protagonistas de cada sección, se presenta en Arial Black, siempre en mayúsculas, con un tamaño aproximado de </w:t>
+        <w:t>Arial</w:t>
+      </w:r>
+      <w:r>
+        <w:rPr>
+          <w:rFonts w:ascii="Calibri" w:hAnsi="Calibri" w:cs="Calibri"/>
+        </w:rPr>
+        <w:t xml:space="preserve"> y para el encabezado de PORTAFOLIO se utiliza times new roman en serif y tamaño responsivo </w:t>
+      </w:r>
+      <w:r>
+        <w:rPr>
+          <w:rFonts w:ascii="Calibri" w:hAnsi="Calibri" w:cs="Calibri"/>
+        </w:rPr>
+        <w:t xml:space="preserve"> buscando mantener una identidad visual directa, contundente y fácil de leer. </w:t>
       </w:r>
       <w:r>
         <w:rPr>
@@ -803,21 +759,40 @@
           <w:b w:val="0"/>
           <w:bCs w:val="0"/>
         </w:rPr>
-        <w:t>80 a 120 px</w:t>
-      </w:r>
-      <w:r>
-        <w:rPr>
-          <w:rFonts w:ascii="Calibri" w:hAnsi="Calibri" w:cs="Calibri"/>
-          <w:b/>
-          <w:bCs/>
-        </w:rPr>
-        <w:t xml:space="preserve"> </w:t>
-      </w:r>
-      <w:r>
-        <w:rPr>
-          <w:rFonts w:ascii="Calibri" w:hAnsi="Calibri" w:cs="Calibri"/>
-        </w:rPr>
-        <w:t xml:space="preserve">y un interlineado compacto de entre </w:t>
+        <w:t>Arial Black</w:t>
+      </w:r>
+      <w:r>
+        <w:rPr>
+          <w:rFonts w:ascii="Calibri" w:hAnsi="Calibri" w:cs="Calibri"/>
+        </w:rPr>
+        <w:t xml:space="preserve"> funciona como la tipografía principal para títulos, encabezados y elementos de alto impacto, mientras que </w:t>
+      </w:r>
+      <w:r>
+        <w:rPr>
+          <w:rStyle w:val="Textoennegrita"/>
+          <w:rFonts w:ascii="Calibri" w:hAnsi="Calibri" w:cs="Calibri"/>
+        </w:rPr>
+        <w:t>Arial</w:t>
+      </w:r>
+      <w:r>
+        <w:rPr>
+          <w:rFonts w:ascii="Calibri" w:hAnsi="Calibri" w:cs="Calibri"/>
+        </w:rPr>
+        <w:t xml:space="preserve"> se utiliza para textos informativos, descripciones, navegación y contenido general. Esta combinación permite conservar el carácter fuerte y gráfico que ya está presente en mi portafolio, especialmente en los grandes títulos de las categorías. portafolio 2026</w:t>
+      </w:r>
+    </w:p>
+    <w:p>
+      <w:pPr>
+        <w:pStyle w:val="NormalWeb"/>
+        <w:rPr>
+          <w:rFonts w:ascii="Calibri" w:hAnsi="Calibri" w:cs="Calibri"/>
+        </w:rPr>
+      </w:pPr>
+      <w:r>
+        <w:rPr>
+          <w:rFonts w:ascii="Calibri" w:hAnsi="Calibri" w:cs="Calibri"/>
+        </w:rPr>
+        <w:t xml:space="preserve">El </w:t>
       </w:r>
       <w:r>
         <w:rPr>
@@ -826,35 +801,13 @@
           <w:b w:val="0"/>
           <w:bCs w:val="0"/>
         </w:rPr>
-        <w:t>85 y 110 px</w:t>
-      </w:r>
-      <w:r>
-        <w:rPr>
-          <w:rFonts w:ascii="Calibri" w:hAnsi="Calibri" w:cs="Calibri"/>
-          <w:b/>
-          <w:bCs/>
-        </w:rPr>
-        <w:t>.</w:t>
-      </w:r>
-      <w:r>
-        <w:rPr>
-          <w:rFonts w:ascii="Calibri" w:hAnsi="Calibri" w:cs="Calibri"/>
-        </w:rPr>
-        <w:t xml:space="preserve"> </w:t>
-      </w:r>
-    </w:p>
-    <w:p>
-      <w:pPr>
-        <w:pStyle w:val="NormalWeb"/>
-        <w:rPr>
-          <w:rFonts w:ascii="Calibri" w:hAnsi="Calibri" w:cs="Calibri"/>
-        </w:rPr>
-      </w:pPr>
-      <w:r>
-        <w:rPr>
-          <w:rFonts w:ascii="Calibri" w:hAnsi="Calibri" w:cs="Calibri"/>
-        </w:rPr>
-        <w:t xml:space="preserve">Los </w:t>
+        <w:t>display</w:t>
+      </w:r>
+      <w:r>
+        <w:rPr>
+          <w:rFonts w:ascii="Calibri" w:hAnsi="Calibri" w:cs="Calibri"/>
+        </w:rPr>
+        <w:t xml:space="preserve">, utilizado para los títulos de mayor impacto y palabras protagonistas de cada sección, se presenta en Arial Black, siempre en mayúsculas, con un tamaño aproximado de </w:t>
       </w:r>
       <w:r>
         <w:rPr>
@@ -863,13 +816,21 @@
           <w:b w:val="0"/>
           <w:bCs w:val="0"/>
         </w:rPr>
-        <w:t>títulos principales o H1</w:t>
-      </w:r>
-      <w:r>
-        <w:rPr>
-          <w:rFonts w:ascii="Calibri" w:hAnsi="Calibri" w:cs="Calibri"/>
-        </w:rPr>
-        <w:t xml:space="preserve"> utilizan Arial Black entre </w:t>
+        <w:t>80 a 120 px</w:t>
+      </w:r>
+      <w:r>
+        <w:rPr>
+          <w:rFonts w:ascii="Calibri" w:hAnsi="Calibri" w:cs="Calibri"/>
+          <w:b/>
+          <w:bCs/>
+        </w:rPr>
+        <w:t xml:space="preserve"> </w:t>
+      </w:r>
+      <w:r>
+        <w:rPr>
+          <w:rFonts w:ascii="Calibri" w:hAnsi="Calibri" w:cs="Calibri"/>
+        </w:rPr>
+        <w:t xml:space="preserve">y un interlineado compacto de entre </w:t>
       </w:r>
       <w:r>
         <w:rPr>
@@ -878,13 +839,35 @@
           <w:b w:val="0"/>
           <w:bCs w:val="0"/>
         </w:rPr>
-        <w:t>56 y 72 px</w:t>
-      </w:r>
-      <w:r>
-        <w:rPr>
-          <w:rFonts w:ascii="Calibri" w:hAnsi="Calibri" w:cs="Calibri"/>
-        </w:rPr>
-        <w:t xml:space="preserve">, generalmente en mayúsculas, para identificar proyectos y secciones importantes. Los </w:t>
+        <w:t>85 y 110 px</w:t>
+      </w:r>
+      <w:r>
+        <w:rPr>
+          <w:rFonts w:ascii="Calibri" w:hAnsi="Calibri" w:cs="Calibri"/>
+          <w:b/>
+          <w:bCs/>
+        </w:rPr>
+        <w:t>.</w:t>
+      </w:r>
+      <w:r>
+        <w:rPr>
+          <w:rFonts w:ascii="Calibri" w:hAnsi="Calibri" w:cs="Calibri"/>
+        </w:rPr>
+        <w:t xml:space="preserve"> </w:t>
+      </w:r>
+    </w:p>
+    <w:p>
+      <w:pPr>
+        <w:pStyle w:val="NormalWeb"/>
+        <w:rPr>
+          <w:rFonts w:ascii="Calibri" w:hAnsi="Calibri" w:cs="Calibri"/>
+        </w:rPr>
+      </w:pPr>
+      <w:r>
+        <w:rPr>
+          <w:rFonts w:ascii="Calibri" w:hAnsi="Calibri" w:cs="Calibri"/>
+        </w:rPr>
+        <w:t xml:space="preserve">Los </w:t>
       </w:r>
       <w:r>
         <w:rPr>
@@ -893,7 +876,7 @@
           <w:b w:val="0"/>
           <w:bCs w:val="0"/>
         </w:rPr>
-        <w:t>títulos secundarios o H2</w:t>
+        <w:t>títulos principales o H1</w:t>
       </w:r>
       <w:r>
         <w:rPr>
@@ -908,13 +891,13 @@
           <w:b w:val="0"/>
           <w:bCs w:val="0"/>
         </w:rPr>
-        <w:t>36 y 48 px</w:t>
-      </w:r>
-      <w:r>
-        <w:rPr>
-          <w:rFonts w:ascii="Calibri" w:hAnsi="Calibri" w:cs="Calibri"/>
-        </w:rPr>
-        <w:t xml:space="preserve">, mientras que los </w:t>
+        <w:t>56 y 72 px</w:t>
+      </w:r>
+      <w:r>
+        <w:rPr>
+          <w:rFonts w:ascii="Calibri" w:hAnsi="Calibri" w:cs="Calibri"/>
+        </w:rPr>
+        <w:t xml:space="preserve">, generalmente en mayúsculas, para identificar proyectos y secciones importantes. Los </w:t>
       </w:r>
       <w:r>
         <w:rPr>
@@ -923,13 +906,13 @@
           <w:b w:val="0"/>
           <w:bCs w:val="0"/>
         </w:rPr>
-        <w:t>subtítulos o H3</w:t>
-      </w:r>
-      <w:r>
-        <w:rPr>
-          <w:rFonts w:ascii="Calibri" w:hAnsi="Calibri" w:cs="Calibri"/>
-        </w:rPr>
-        <w:t xml:space="preserve"> se mantienen entre </w:t>
+        <w:t>títulos secundarios o H2</w:t>
+      </w:r>
+      <w:r>
+        <w:rPr>
+          <w:rFonts w:ascii="Calibri" w:hAnsi="Calibri" w:cs="Calibri"/>
+        </w:rPr>
+        <w:t xml:space="preserve"> utilizan Arial Black entre </w:t>
       </w:r>
       <w:r>
         <w:rPr>
@@ -938,35 +921,13 @@
           <w:b w:val="0"/>
           <w:bCs w:val="0"/>
         </w:rPr>
-        <w:t>22 y 28 px</w:t>
-      </w:r>
-      <w:r>
-        <w:rPr>
-          <w:rFonts w:ascii="Calibri" w:hAnsi="Calibri" w:cs="Calibri"/>
-          <w:b/>
-          <w:bCs/>
-        </w:rPr>
-        <w:t>,</w:t>
-      </w:r>
-      <w:r>
-        <w:rPr>
-          <w:rFonts w:ascii="Calibri" w:hAnsi="Calibri" w:cs="Calibri"/>
-        </w:rPr>
-        <w:t xml:space="preserve"> permitiendo establecer diferentes niveles de información sin perder consistencia.</w:t>
-      </w:r>
-    </w:p>
-    <w:p>
-      <w:pPr>
-        <w:pStyle w:val="NormalWeb"/>
-        <w:rPr>
-          <w:rFonts w:ascii="Calibri" w:hAnsi="Calibri" w:cs="Calibri"/>
-        </w:rPr>
-      </w:pPr>
-      <w:r>
-        <w:rPr>
-          <w:rFonts w:ascii="Calibri" w:hAnsi="Calibri" w:cs="Calibri"/>
-        </w:rPr>
-        <w:t xml:space="preserve">Para el </w:t>
+        <w:t>36 y 48 px</w:t>
+      </w:r>
+      <w:r>
+        <w:rPr>
+          <w:rFonts w:ascii="Calibri" w:hAnsi="Calibri" w:cs="Calibri"/>
+        </w:rPr>
+        <w:t xml:space="preserve">, mientras que los </w:t>
       </w:r>
       <w:r>
         <w:rPr>
@@ -975,13 +936,13 @@
           <w:b w:val="0"/>
           <w:bCs w:val="0"/>
         </w:rPr>
-        <w:t>cuerpo de texto</w:t>
-      </w:r>
-      <w:r>
-        <w:rPr>
-          <w:rFonts w:ascii="Calibri" w:hAnsi="Calibri" w:cs="Calibri"/>
-        </w:rPr>
-        <w:t xml:space="preserve"> utilizo Arial Regular entre </w:t>
+        <w:t>subtítulos o H3</w:t>
+      </w:r>
+      <w:r>
+        <w:rPr>
+          <w:rFonts w:ascii="Calibri" w:hAnsi="Calibri" w:cs="Calibri"/>
+        </w:rPr>
+        <w:t xml:space="preserve"> se mantienen entre </w:t>
       </w:r>
       <w:r>
         <w:rPr>
@@ -990,7 +951,7 @@
           <w:b w:val="0"/>
           <w:bCs w:val="0"/>
         </w:rPr>
-        <w:t>16 y 18 px</w:t>
+        <w:t>22 y 28 px</w:t>
       </w:r>
       <w:r>
         <w:rPr>
@@ -1004,7 +965,21 @@
         <w:rPr>
           <w:rFonts w:ascii="Calibri" w:hAnsi="Calibri" w:cs="Calibri"/>
         </w:rPr>
-        <w:t xml:space="preserve"> con un interlineado aproximado de </w:t>
+        <w:t xml:space="preserve"> permitiendo establecer diferentes niveles de información sin perder consistencia.</w:t>
+      </w:r>
+    </w:p>
+    <w:p>
+      <w:pPr>
+        <w:pStyle w:val="NormalWeb"/>
+        <w:rPr>
+          <w:rFonts w:ascii="Calibri" w:hAnsi="Calibri" w:cs="Calibri"/>
+        </w:rPr>
+      </w:pPr>
+      <w:r>
+        <w:rPr>
+          <w:rFonts w:ascii="Calibri" w:hAnsi="Calibri" w:cs="Calibri"/>
+        </w:rPr>
+        <w:t xml:space="preserve">Para el </w:t>
       </w:r>
       <w:r>
         <w:rPr>
@@ -1013,21 +988,13 @@
           <w:b w:val="0"/>
           <w:bCs w:val="0"/>
         </w:rPr>
-        <w:t>24 a 28 px</w:t>
-      </w:r>
-      <w:r>
-        <w:rPr>
-          <w:rFonts w:ascii="Calibri" w:hAnsi="Calibri" w:cs="Calibri"/>
-          <w:b/>
-          <w:bCs/>
-        </w:rPr>
-        <w:t>,</w:t>
-      </w:r>
-      <w:r>
-        <w:rPr>
-          <w:rFonts w:ascii="Calibri" w:hAnsi="Calibri" w:cs="Calibri"/>
-        </w:rPr>
-        <w:t xml:space="preserve"> priorizando la legibilidad en descripciones de proyectos, procesos y textos sobre mí. Los textos pequeños, como categorías, fechas, etiquetas o información complementaria, utilizan Arial Regular entre </w:t>
+        <w:t>cuerpo de texto</w:t>
+      </w:r>
+      <w:r>
+        <w:rPr>
+          <w:rFonts w:ascii="Calibri" w:hAnsi="Calibri" w:cs="Calibri"/>
+        </w:rPr>
+        <w:t xml:space="preserve"> utilizo Arial Regular entre </w:t>
       </w:r>
       <w:r>
         <w:rPr>
@@ -1036,21 +1003,21 @@
           <w:b w:val="0"/>
           <w:bCs w:val="0"/>
         </w:rPr>
-        <w:t>13 y 14 px</w:t>
-      </w:r>
-      <w:r>
-        <w:rPr>
-          <w:rFonts w:ascii="Calibri" w:hAnsi="Calibri" w:cs="Calibri"/>
-          <w:b/>
-          <w:bCs/>
-        </w:rPr>
-        <w:t>.</w:t>
-      </w:r>
-      <w:r>
-        <w:rPr>
-          <w:rFonts w:ascii="Calibri" w:hAnsi="Calibri" w:cs="Calibri"/>
-        </w:rPr>
-        <w:t xml:space="preserve"> La navegación y los botones pueden utilizar Arial Bold o Arial Black entre </w:t>
+        <w:t>16 y 18 px</w:t>
+      </w:r>
+      <w:r>
+        <w:rPr>
+          <w:rFonts w:ascii="Calibri" w:hAnsi="Calibri" w:cs="Calibri"/>
+          <w:b/>
+          <w:bCs/>
+        </w:rPr>
+        <w:t>,</w:t>
+      </w:r>
+      <w:r>
+        <w:rPr>
+          <w:rFonts w:ascii="Calibri" w:hAnsi="Calibri" w:cs="Calibri"/>
+        </w:rPr>
+        <w:t xml:space="preserve"> con un interlineado aproximado de </w:t>
       </w:r>
       <w:r>
         <w:rPr>
@@ -1059,6 +1026,59 @@
           <w:b w:val="0"/>
           <w:bCs w:val="0"/>
         </w:rPr>
+        <w:t>24 a 28 px</w:t>
+      </w:r>
+      <w:r>
+        <w:rPr>
+          <w:rFonts w:ascii="Calibri" w:hAnsi="Calibri" w:cs="Calibri"/>
+          <w:b/>
+          <w:bCs/>
+        </w:rPr>
+        <w:t>,</w:t>
+      </w:r>
+      <w:r>
+        <w:rPr>
+          <w:rFonts w:ascii="Calibri" w:hAnsi="Calibri" w:cs="Calibri"/>
+        </w:rPr>
+        <w:t xml:space="preserve"> priorizando la legibilidad en descripciones de proyectos, procesos y textos sobre </w:t>
+      </w:r>
+      <w:r>
+        <w:rPr>
+          <w:rFonts w:ascii="Calibri" w:hAnsi="Calibri" w:cs="Calibri"/>
+        </w:rPr>
+        <w:lastRenderedPageBreak/>
+        <w:t xml:space="preserve">mí. Los textos pequeños, como categorías, fechas, etiquetas o información complementaria, utilizan Arial Regular entre </w:t>
+      </w:r>
+      <w:r>
+        <w:rPr>
+          <w:rStyle w:val="Textoennegrita"/>
+          <w:rFonts w:ascii="Calibri" w:hAnsi="Calibri" w:cs="Calibri"/>
+          <w:b w:val="0"/>
+          <w:bCs w:val="0"/>
+        </w:rPr>
+        <w:t>13 y 14 px</w:t>
+      </w:r>
+      <w:r>
+        <w:rPr>
+          <w:rFonts w:ascii="Calibri" w:hAnsi="Calibri" w:cs="Calibri"/>
+          <w:b/>
+          <w:bCs/>
+        </w:rPr>
+        <w:t>.</w:t>
+      </w:r>
+      <w:r>
+        <w:rPr>
+          <w:rFonts w:ascii="Calibri" w:hAnsi="Calibri" w:cs="Calibri"/>
+        </w:rPr>
+        <w:t xml:space="preserve"> La navegación y los botones pueden utilizar Arial Bold o Arial Black entre </w:t>
+      </w:r>
+      <w:r>
+        <w:rPr>
+          <w:rStyle w:val="Textoennegrita"/>
+          <w:rFonts w:ascii="Calibri" w:hAnsi="Calibri" w:cs="Calibri"/>
+          <w:b w:val="0"/>
+          <w:bCs w:val="0"/>
+        </w:rPr>
         <w:t>14 y 16 px</w:t>
       </w:r>
       <w:r>
@@ -1086,16 +1106,7 @@
           <w:bCs/>
           <w:color w:val="202225"/>
         </w:rPr>
-        <w:t>4</w:t>
-      </w:r>
-      <w:r>
-        <w:rPr>
-          <w:rFonts w:ascii="Calibri" w:eastAsia="Calibri" w:hAnsi="Calibri" w:cs="Calibri"/>
-          <w:b/>
-          <w:bCs/>
-          <w:color w:val="202225"/>
-        </w:rPr>
-        <w:t xml:space="preserve"> · Layout y espaciado</w:t>
+        <w:t>4 · Layout y espaciado</w:t>
       </w:r>
     </w:p>
     <w:p>
@@ -1136,7 +1147,6 @@
         <w:rPr>
           <w:rFonts w:ascii="Calibri" w:hAnsi="Calibri" w:cs="Calibri"/>
         </w:rPr>
-        <w:lastRenderedPageBreak/>
         <w:t xml:space="preserve">En escritorio trabajo sobre una rejilla de </w:t>
       </w:r>
       <w:r>
@@ -1209,15 +1219,7 @@
           <w:b/>
           <w:bCs/>
         </w:rPr>
-        <w:t>:</w:t>
-      </w:r>
-      <w:r>
-        <w:rPr>
-          <w:rFonts w:ascii="Calibri" w:hAnsi="Calibri" w:cs="Calibri"/>
-          <w:b/>
-          <w:bCs/>
-        </w:rPr>
-        <w:t xml:space="preserve"> </w:t>
+        <w:t xml:space="preserve">: </w:t>
       </w:r>
       <w:r>
         <w:rPr>
@@ -1366,16 +1368,62 @@
           <w:bCs/>
           <w:color w:val="202225"/>
         </w:rPr>
-        <w:t>5</w:t>
-      </w:r>
-      <w:r>
+        <w:t>5 · Profundidad</w:t>
+      </w:r>
+    </w:p>
+    <w:p>
+      <w:pPr>
+        <w:rPr>
+          <w:rFonts w:ascii="Calibri" w:hAnsi="Calibri" w:cs="Calibri"/>
+          <w:sz w:val="24"/>
+          <w:szCs w:val="24"/>
+        </w:rPr>
+      </w:pPr>
+      <w:r>
+        <w:rPr>
+          <w:rFonts w:ascii="Calibri" w:hAnsi="Calibri" w:cs="Calibri"/>
+          <w:sz w:val="24"/>
+          <w:szCs w:val="24"/>
+        </w:rPr>
+        <w:t>Predominan superficies #050505, #050610, #090B16 y #090C1A, con bloques azul profundo y portada con gradiente radial oscuro. La sección Contacto recupera el fondo azul intenso con imagen de textura. Sobre mí presenta bordes superiores curvos, y algunos componentes usan esquinas redondeadas de 10 a 30 px.</w:t>
+      </w:r>
+    </w:p>
+    <w:p>
+      <w:pPr>
+        <w:rPr>
+          <w:rFonts w:ascii="Calibri" w:hAnsi="Calibri" w:cs="Calibri"/>
+          <w:sz w:val="24"/>
+          <w:szCs w:val="24"/>
+        </w:rPr>
+      </w:pPr>
+      <w:r>
+        <w:rPr>
+          <w:rFonts w:ascii="Calibri" w:hAnsi="Calibri" w:cs="Calibri"/>
+          <w:sz w:val="24"/>
+          <w:szCs w:val="24"/>
+        </w:rPr>
+        <w:t>El sistema real emplea sombras, resplandores y bordes luminosos para señalar interacción. No debe mantenerse como regla absoluta la prohibición de radios mayores a 8 px ni de sombras, ya que contradice el index.</w:t>
+      </w:r>
+    </w:p>
+    <w:p>
+      <w:pPr>
+        <w:pStyle w:val="Ttulo1"/>
+        <w:spacing w:before="340" w:after="120"/>
         <w:rPr>
           <w:rFonts w:ascii="Calibri" w:eastAsia="Calibri" w:hAnsi="Calibri" w:cs="Calibri"/>
           <w:b/>
           <w:bCs/>
           <w:color w:val="202225"/>
         </w:rPr>
-        <w:t xml:space="preserve"> · Profundidad</w:t>
+      </w:pPr>
+      <w:r>
+        <w:rPr>
+          <w:rFonts w:ascii="Calibri" w:eastAsia="Calibri" w:hAnsi="Calibri" w:cs="Calibri"/>
+          <w:b/>
+          <w:bCs/>
+          <w:color w:val="202225"/>
+        </w:rPr>
+        <w:t>6 · Formas</w:t>
       </w:r>
     </w:p>
     <w:p>
@@ -1389,7 +1437,7 @@
         <w:rPr>
           <w:rFonts w:ascii="Calibri" w:hAnsi="Calibri" w:cs="Calibri"/>
         </w:rPr>
-        <w:t xml:space="preserve">El diseño debe mantenerse principalmente </w:t>
+        <w:t xml:space="preserve">Mi sistema visual utiliza principalmente </w:t>
       </w:r>
       <w:r>
         <w:rPr>
@@ -1398,38 +1446,317 @@
           <w:b w:val="0"/>
           <w:bCs w:val="0"/>
         </w:rPr>
-        <w:t>plano</w:t>
-      </w:r>
-      <w:r>
-        <w:rPr>
-          <w:rFonts w:ascii="Calibri" w:hAnsi="Calibri" w:cs="Calibri"/>
-        </w:rPr>
-        <w:t xml:space="preserve"> </w:t>
-      </w:r>
-      <w:r>
-        <w:rPr>
-          <w:rFonts w:ascii="Calibri" w:eastAsia="Calibri" w:hAnsi="Calibri" w:cs="Calibri"/>
-          <w:color w:val="202225"/>
-        </w:rPr>
-        <w:t xml:space="preserve">Uso sombras suaves y difusas solo cuando hay interacción o apilamiento. Los niveles son: plano (sin sombra) para tarjetas en reposo, campos y navegación; </w:t>
-      </w:r>
-      <w:r>
-        <w:rPr>
-          <w:rFonts w:ascii="Calibri" w:hAnsi="Calibri" w:cs="Calibri"/>
-        </w:rPr>
-        <w:t>Las sombras solamente pueden aparecer de forma muy sutil cuando ayuden a indicar que un elemento es interactivo.</w:t>
-      </w:r>
-      <w:r>
-        <w:rPr>
-          <w:rFonts w:ascii="Calibri" w:hAnsi="Calibri" w:cs="Calibri"/>
-        </w:rPr>
-        <w:t xml:space="preserve"> </w:t>
-      </w:r>
-      <w:r>
-        <w:rPr>
-          <w:rFonts w:ascii="Calibri" w:hAnsi="Calibri" w:cs="Calibri"/>
-        </w:rPr>
-        <w:t>Las imágenes de los proyectos sí pueden contener sombras o efectos propios de sus mockups.</w:t>
+        <w:t>formas geométricas, rectangulares y de bordes definidos</w:t>
+      </w:r>
+      <w:r>
+        <w:rPr>
+          <w:rFonts w:ascii="Calibri" w:hAnsi="Calibri" w:cs="Calibri"/>
+          <w:b/>
+          <w:bCs/>
+        </w:rPr>
+        <w:t>,</w:t>
+      </w:r>
+      <w:r>
+        <w:rPr>
+          <w:rFonts w:ascii="Calibri" w:hAnsi="Calibri" w:cs="Calibri"/>
+        </w:rPr>
+        <w:t xml:space="preserve"> manteniendo una estética gráfica y editorial. Las esquinas por defecto tienen un </w:t>
+      </w:r>
+      <w:r>
+        <w:rPr>
+          <w:rStyle w:val="Textoennegrita"/>
+          <w:rFonts w:ascii="Calibri" w:hAnsi="Calibri" w:cs="Calibri"/>
+          <w:b w:val="0"/>
+          <w:bCs w:val="0"/>
+        </w:rPr>
+        <w:t>radio de 0 px</w:t>
+      </w:r>
+      <w:r>
+        <w:rPr>
+          <w:rFonts w:ascii="Calibri" w:hAnsi="Calibri" w:cs="Calibri"/>
+          <w:b/>
+          <w:bCs/>
+        </w:rPr>
+        <w:t>,</w:t>
+      </w:r>
+      <w:r>
+        <w:rPr>
+          <w:rFonts w:ascii="Calibri" w:hAnsi="Calibri" w:cs="Calibri"/>
+        </w:rPr>
+        <w:t xml:space="preserve"> especialmente en imágenes, bloques de contenido, galerías y secciones principales. En elementos interactivos pequeños puedo utilizar un redondeo sutil de </w:t>
+      </w:r>
+      <w:r>
+        <w:rPr>
+          <w:rStyle w:val="Textoennegrita"/>
+          <w:rFonts w:ascii="Calibri" w:hAnsi="Calibri" w:cs="Calibri"/>
+          <w:b w:val="0"/>
+          <w:bCs w:val="0"/>
+        </w:rPr>
+        <w:t>4 px</w:t>
+      </w:r>
+      <w:r>
+        <w:rPr>
+          <w:rFonts w:ascii="Calibri" w:hAnsi="Calibri" w:cs="Calibri"/>
+        </w:rPr>
+        <w:t xml:space="preserve">, mientras que los botones y etiquetas pueden tener un radio máximo de </w:t>
+      </w:r>
+      <w:r>
+        <w:rPr>
+          <w:rStyle w:val="Textoennegrita"/>
+          <w:rFonts w:ascii="Calibri" w:hAnsi="Calibri" w:cs="Calibri"/>
+          <w:b w:val="0"/>
+          <w:bCs w:val="0"/>
+        </w:rPr>
+        <w:t>8 px</w:t>
+      </w:r>
+      <w:r>
+        <w:rPr>
+          <w:rFonts w:ascii="Calibri" w:hAnsi="Calibri" w:cs="Calibri"/>
+          <w:b/>
+          <w:bCs/>
+        </w:rPr>
+        <w:t xml:space="preserve">. </w:t>
+      </w:r>
+      <w:r>
+        <w:rPr>
+          <w:rFonts w:ascii="Calibri" w:hAnsi="Calibri" w:cs="Calibri"/>
+        </w:rPr>
+        <w:t>Evito radios mayores porque las formas excesivamente redondeadas no corresponden con la personalidad visual de mi portafolio.</w:t>
+      </w:r>
+    </w:p>
+    <w:p>
+      <w:pPr>
+        <w:pStyle w:val="NormalWeb"/>
+        <w:rPr>
+          <w:rFonts w:ascii="Calibri" w:hAnsi="Calibri" w:cs="Calibri"/>
+        </w:rPr>
+      </w:pPr>
+      <w:r>
+        <w:rPr>
+          <w:rFonts w:ascii="Calibri" w:hAnsi="Calibri" w:cs="Calibri"/>
+        </w:rPr>
+        <w:lastRenderedPageBreak/>
+        <w:t xml:space="preserve">La </w:t>
+      </w:r>
+      <w:r>
+        <w:rPr>
+          <w:rStyle w:val="Textoennegrita"/>
+          <w:rFonts w:ascii="Calibri" w:hAnsi="Calibri" w:cs="Calibri"/>
+          <w:b w:val="0"/>
+          <w:bCs w:val="0"/>
+        </w:rPr>
+        <w:t>estrella de cinco puntas</w:t>
+      </w:r>
+      <w:r>
+        <w:rPr>
+          <w:rFonts w:ascii="Calibri" w:hAnsi="Calibri" w:cs="Calibri"/>
+        </w:rPr>
+        <w:t xml:space="preserve"> funciona como uno de los recursos gráficos característicos de mi identidad, como ya aparece en la portada y otros elementos de tu portafolio. portafolio 2026 En escritorio, una estrella decorativa principal puede medir aproximadamente </w:t>
+      </w:r>
+      <w:r>
+        <w:rPr>
+          <w:rStyle w:val="Textoennegrita"/>
+          <w:rFonts w:ascii="Calibri" w:hAnsi="Calibri" w:cs="Calibri"/>
+          <w:b w:val="0"/>
+          <w:bCs w:val="0"/>
+        </w:rPr>
+        <w:t>48 × 48 px</w:t>
+      </w:r>
+      <w:r>
+        <w:rPr>
+          <w:rFonts w:ascii="Calibri" w:hAnsi="Calibri" w:cs="Calibri"/>
+          <w:b/>
+          <w:bCs/>
+        </w:rPr>
+        <w:t>,</w:t>
+      </w:r>
+      <w:r>
+        <w:rPr>
+          <w:rFonts w:ascii="Calibri" w:hAnsi="Calibri" w:cs="Calibri"/>
+        </w:rPr>
+        <w:t xml:space="preserve"> mientras que las estrellas secundarias pueden variar entre </w:t>
+      </w:r>
+      <w:r>
+        <w:rPr>
+          <w:rStyle w:val="Textoennegrita"/>
+          <w:rFonts w:ascii="Calibri" w:hAnsi="Calibri" w:cs="Calibri"/>
+          <w:b w:val="0"/>
+          <w:bCs w:val="0"/>
+        </w:rPr>
+        <w:t>24 × 24 px y 32 × 32 px</w:t>
+      </w:r>
+      <w:r>
+        <w:rPr>
+          <w:rFonts w:ascii="Calibri" w:hAnsi="Calibri" w:cs="Calibri"/>
+        </w:rPr>
+        <w:t xml:space="preserve">. Para detalles pequeños o indicadores utilizo estrellas de </w:t>
+      </w:r>
+      <w:r>
+        <w:rPr>
+          <w:rStyle w:val="Textoennegrita"/>
+          <w:rFonts w:ascii="Calibri" w:hAnsi="Calibri" w:cs="Calibri"/>
+          <w:b w:val="0"/>
+          <w:bCs w:val="0"/>
+        </w:rPr>
+        <w:t>16 × 16 px</w:t>
+      </w:r>
+      <w:r>
+        <w:rPr>
+          <w:rFonts w:ascii="Calibri" w:hAnsi="Calibri" w:cs="Calibri"/>
+          <w:b/>
+          <w:bCs/>
+        </w:rPr>
+        <w:t>.</w:t>
+      </w:r>
+      <w:r>
+        <w:rPr>
+          <w:rFonts w:ascii="Calibri" w:hAnsi="Calibri" w:cs="Calibri"/>
+        </w:rPr>
+        <w:t xml:space="preserve"> En composiciones especiales o fondos, una estrella puede aumentar hasta </w:t>
+      </w:r>
+      <w:r>
+        <w:rPr>
+          <w:rStyle w:val="Textoennegrita"/>
+          <w:rFonts w:ascii="Calibri" w:hAnsi="Calibri" w:cs="Calibri"/>
+          <w:b w:val="0"/>
+          <w:bCs w:val="0"/>
+        </w:rPr>
+        <w:t>80–120 px</w:t>
+      </w:r>
+      <w:r>
+        <w:rPr>
+          <w:rFonts w:ascii="Calibri" w:hAnsi="Calibri" w:cs="Calibri"/>
+          <w:b/>
+          <w:bCs/>
+        </w:rPr>
+        <w:t>,</w:t>
+      </w:r>
+      <w:r>
+        <w:rPr>
+          <w:rFonts w:ascii="Calibri" w:hAnsi="Calibri" w:cs="Calibri"/>
+        </w:rPr>
+        <w:t xml:space="preserve"> siempre que no interfiera con la lectura ni compita con los proyectos.</w:t>
+      </w:r>
+    </w:p>
+    <w:p>
+      <w:pPr>
+        <w:pStyle w:val="NormalWeb"/>
+        <w:rPr>
+          <w:rFonts w:ascii="Calibri" w:hAnsi="Calibri" w:cs="Calibri"/>
+        </w:rPr>
+      </w:pPr>
+      <w:r>
+        <w:rPr>
+          <w:rFonts w:ascii="Calibri" w:hAnsi="Calibri" w:cs="Calibri"/>
+        </w:rPr>
+        <w:t xml:space="preserve">Las </w:t>
+      </w:r>
+      <w:r>
+        <w:rPr>
+          <w:rStyle w:val="Textoennegrita"/>
+          <w:rFonts w:ascii="Calibri" w:hAnsi="Calibri" w:cs="Calibri"/>
+          <w:b w:val="0"/>
+          <w:bCs w:val="0"/>
+        </w:rPr>
+        <w:t>líneas decorativas</w:t>
+      </w:r>
+      <w:r>
+        <w:rPr>
+          <w:rFonts w:ascii="Calibri" w:hAnsi="Calibri" w:cs="Calibri"/>
+        </w:rPr>
+        <w:t xml:space="preserve"> que acompañan títulos o estrellas deben tener un grosor de </w:t>
+      </w:r>
+      <w:r>
+        <w:rPr>
+          <w:rStyle w:val="Textoennegrita"/>
+          <w:rFonts w:ascii="Calibri" w:hAnsi="Calibri" w:cs="Calibri"/>
+          <w:b w:val="0"/>
+          <w:bCs w:val="0"/>
+        </w:rPr>
+        <w:t>1–2 px</w:t>
+      </w:r>
+      <w:r>
+        <w:rPr>
+          <w:rFonts w:ascii="Calibri" w:hAnsi="Calibri" w:cs="Calibri"/>
+        </w:rPr>
+        <w:t xml:space="preserve"> y pueden extenderse entre </w:t>
+      </w:r>
+      <w:r>
+        <w:rPr>
+          <w:rStyle w:val="Textoennegrita"/>
+          <w:rFonts w:ascii="Calibri" w:hAnsi="Calibri" w:cs="Calibri"/>
+          <w:b w:val="0"/>
+          <w:bCs w:val="0"/>
+        </w:rPr>
+        <w:t>80 y 200 px</w:t>
+      </w:r>
+      <w:r>
+        <w:rPr>
+          <w:rFonts w:ascii="Calibri" w:hAnsi="Calibri" w:cs="Calibri"/>
+          <w:b/>
+          <w:bCs/>
+        </w:rPr>
+        <w:t>,</w:t>
+      </w:r>
+      <w:r>
+        <w:rPr>
+          <w:rFonts w:ascii="Calibri" w:hAnsi="Calibri" w:cs="Calibri"/>
+        </w:rPr>
+        <w:t xml:space="preserve"> dependiendo de la composición.</w:t>
+      </w:r>
+    </w:p>
+    <w:p>
+      <w:pPr>
+        <w:pStyle w:val="Ttulo1"/>
+        <w:rPr>
+          <w:rFonts w:ascii="Calibri" w:hAnsi="Calibri" w:cs="Calibri"/>
+          <w:color w:val="0E2841" w:themeColor="text2"/>
+          <w:sz w:val="28"/>
+          <w:szCs w:val="28"/>
+        </w:rPr>
+      </w:pPr>
+      <w:r>
+        <w:rPr>
+          <w:rFonts w:ascii="Calibri" w:hAnsi="Calibri" w:cs="Calibri"/>
+          <w:color w:val="0E2841" w:themeColor="text2"/>
+          <w:sz w:val="28"/>
+          <w:szCs w:val="28"/>
+        </w:rPr>
+        <w:t>Portada y navegación</w:t>
+      </w:r>
+    </w:p>
+    <w:p>
+      <w:pPr>
+        <w:rPr>
+          <w:rFonts w:ascii="Calibri" w:hAnsi="Calibri" w:cs="Calibri"/>
+          <w:sz w:val="24"/>
+          <w:szCs w:val="24"/>
+        </w:rPr>
+      </w:pPr>
+      <w:r>
+        <w:rPr>
+          <w:rFonts w:ascii="Calibri" w:hAnsi="Calibri" w:cs="Calibri"/>
+          <w:sz w:val="24"/>
+          <w:szCs w:val="24"/>
+        </w:rPr>
+        <w:t>La portada es una composición editorial a altura completa con halo elíptico azul neón, título PORTAFOLIO en serif, metadata Diseño Gráfico y Digital / Edición 2026, estrella separadora y dos accesos a Proyectos y Sobre mí. El título presenta encendido y apagado de luz mediante keyframes; se desactiva la animación con reducción de movimiento.</w:t>
+      </w:r>
+    </w:p>
+    <w:p>
+      <w:pPr>
+        <w:rPr>
+          <w:rFonts w:ascii="Calibri" w:hAnsi="Calibri" w:cs="Calibri"/>
+          <w:sz w:val="24"/>
+          <w:szCs w:val="24"/>
+        </w:rPr>
+      </w:pPr>
+      <w:r>
+        <w:rPr>
+          <w:rFonts w:ascii="Calibri" w:hAnsi="Calibri" w:cs="Calibri"/>
+          <w:sz w:val="24"/>
+          <w:szCs w:val="24"/>
+        </w:rPr>
+        <w:t>La navegación se superpone en la parte superior de la portada como barra translúcida con desenfoque backdrop-filter y logo MSR a la izquierda. Los enlaces usan contorno y brillo azul al pasar el cursor, recibir foco o activarse. En móvil aparece el botón Menú.</w:t>
       </w:r>
     </w:p>
     <w:p>
@@ -1450,97 +1777,266 @@
           <w:bCs/>
           <w:color w:val="202225"/>
         </w:rPr>
-        <w:t>6 · Formas</w:t>
+        <w:t>7 · Componentes</w:t>
+      </w:r>
+    </w:p>
+    <w:p>
+      <w:pPr>
+        <w:pStyle w:val="Ttulo1"/>
+        <w:rPr>
+          <w:rFonts w:ascii="Calibri" w:hAnsi="Calibri" w:cs="Calibri"/>
+          <w:color w:val="0E2841" w:themeColor="text2"/>
+          <w:sz w:val="24"/>
+          <w:szCs w:val="24"/>
+        </w:rPr>
+      </w:pPr>
+      <w:r>
+        <w:rPr>
+          <w:rFonts w:ascii="Calibri" w:hAnsi="Calibri" w:cs="Calibri"/>
+          <w:color w:val="0E2841" w:themeColor="text2"/>
+          <w:sz w:val="24"/>
+          <w:szCs w:val="24"/>
+        </w:rPr>
+        <w:t>Elementos gráficos y movimiento</w:t>
+      </w:r>
+    </w:p>
+    <w:p>
+      <w:pPr>
+        <w:rPr>
+          <w:rFonts w:ascii="Calibri" w:hAnsi="Calibri" w:cs="Calibri"/>
+          <w:sz w:val="24"/>
+          <w:szCs w:val="24"/>
+        </w:rPr>
+      </w:pPr>
+      <w:r>
+        <w:rPr>
+          <w:rFonts w:ascii="Calibri" w:hAnsi="Calibri" w:cs="Calibri"/>
+          <w:sz w:val="24"/>
+          <w:szCs w:val="24"/>
+        </w:rPr>
+        <w:t>Estrellas de cinco puntas azules en el retrato, separadores y galerías; dos estrellas giran en Sobre mí. Una flecha curva señala el retrato. La banda de cualidades se desplaza continuamente de forma horizontal. La portada y Contacto emplean pulsación o encendido LED.</w:t>
+      </w:r>
+    </w:p>
+    <w:p>
+      <w:pPr>
+        <w:rPr>
+          <w:rFonts w:ascii="Calibri" w:hAnsi="Calibri" w:cs="Calibri"/>
+          <w:sz w:val="24"/>
+          <w:szCs w:val="24"/>
+        </w:rPr>
+      </w:pPr>
+      <w:r>
+        <w:rPr>
+          <w:rFonts w:ascii="Calibri" w:hAnsi="Calibri" w:cs="Calibri"/>
+          <w:sz w:val="24"/>
+          <w:szCs w:val="24"/>
+        </w:rPr>
+        <w:t>Los elementos con clase reveal aparecen al entrar al área visible mediante IntersectionObserver. Se respetan preferencias de movimiento reducido: las animaciones decorativas se detienen y el contenido permanece visible.</w:t>
+      </w:r>
+    </w:p>
+    <w:p/>
+    <w:p>
+      <w:pPr>
+        <w:pStyle w:val="Ttulo3"/>
+        <w:rPr>
+          <w:rFonts w:ascii="Calibri" w:hAnsi="Calibri" w:cs="Calibri"/>
+          <w:b/>
+          <w:bCs/>
+        </w:rPr>
+      </w:pPr>
+      <w:r>
+        <w:rPr>
+          <w:rFonts w:ascii="Calibri" w:hAnsi="Calibri" w:cs="Calibri"/>
+          <w:b/>
+          <w:bCs/>
+        </w:rPr>
+        <w:t>Navegación</w:t>
       </w:r>
     </w:p>
     <w:p>
       <w:pPr>
         <w:pStyle w:val="NormalWeb"/>
         <w:rPr>
-          <w:rFonts w:ascii="Calibri" w:hAnsi="Calibri" w:cs="Calibri"/>
-        </w:rPr>
-      </w:pPr>
-      <w:r>
-        <w:rPr>
-          <w:rFonts w:ascii="Calibri" w:hAnsi="Calibri" w:cs="Calibri"/>
-        </w:rPr>
-        <w:t xml:space="preserve">Mi sistema visual utiliza principalmente </w:t>
-      </w:r>
-      <w:r>
-        <w:rPr>
-          <w:rStyle w:val="Textoennegrita"/>
+          <w:rStyle w:val="Textoennegrita"/>
+          <w:rFonts w:ascii="Calibri" w:hAnsi="Calibri" w:cs="Calibri"/>
+        </w:rPr>
+      </w:pPr>
+      <w:r>
+        <w:rPr>
+          <w:rFonts w:ascii="Calibri" w:hAnsi="Calibri" w:cs="Calibri"/>
+        </w:rPr>
+        <w:t>La navegación debe ser sencilla y permanecer visualmente limpia</w:t>
+      </w:r>
+      <w:r>
+        <w:rPr>
+          <w:rFonts w:ascii="Calibri" w:hAnsi="Calibri" w:cs="Calibri"/>
+        </w:rPr>
+        <w:t>, incluye:</w:t>
+      </w:r>
+      <w:r>
+        <w:rPr>
+          <w:rStyle w:val="Textoennegrita"/>
+          <w:rFonts w:ascii="Calibri" w:hAnsi="Calibri" w:cs="Calibri"/>
+        </w:rPr>
+        <w:t>Inicio</w:t>
+      </w:r>
+      <w:r>
+        <w:rPr>
+          <w:rStyle w:val="Textoennegrita"/>
+          <w:rFonts w:ascii="Calibri" w:hAnsi="Calibri" w:cs="Calibri"/>
+        </w:rPr>
+        <w:t xml:space="preserve">, </w:t>
+      </w:r>
+      <w:r>
+        <w:rPr>
+          <w:rStyle w:val="Textoennegrita"/>
+          <w:rFonts w:ascii="Calibri" w:hAnsi="Calibri" w:cs="Calibri"/>
+        </w:rPr>
+        <w:t>Sobre mí</w:t>
+      </w:r>
+      <w:r>
+        <w:rPr>
+          <w:rStyle w:val="Textoennegrita"/>
+          <w:rFonts w:ascii="Calibri" w:hAnsi="Calibri" w:cs="Calibri"/>
+        </w:rPr>
+        <w:t xml:space="preserve">, </w:t>
+      </w:r>
+      <w:r>
+        <w:rPr>
+          <w:rStyle w:val="Textoennegrita"/>
+          <w:rFonts w:ascii="Calibri" w:hAnsi="Calibri" w:cs="Calibri"/>
+        </w:rPr>
+        <w:t>Proyectos</w:t>
+      </w:r>
+      <w:r>
+        <w:rPr>
+          <w:rStyle w:val="Textoennegrita"/>
+          <w:rFonts w:ascii="Calibri" w:hAnsi="Calibri" w:cs="Calibri"/>
+        </w:rPr>
+        <w:t xml:space="preserve">, </w:t>
+      </w:r>
+      <w:r>
+        <w:rPr>
+          <w:rStyle w:val="Textoennegrita"/>
+          <w:rFonts w:ascii="Calibri" w:hAnsi="Calibri" w:cs="Calibri"/>
+        </w:rPr>
+        <w:t>Contacto</w:t>
+      </w:r>
+    </w:p>
+    <w:p>
+      <w:pPr>
+        <w:pStyle w:val="Fuerte1"/>
+        <w:rPr>
           <w:rFonts w:ascii="Calibri" w:hAnsi="Calibri" w:cs="Calibri"/>
           <w:b w:val="0"/>
           <w:bCs w:val="0"/>
-        </w:rPr>
-        <w:t>formas geométricas, rectangulares y de bordes definidos</w:t>
-      </w:r>
-      <w:r>
-        <w:rPr>
-          <w:rFonts w:ascii="Calibri" w:hAnsi="Calibri" w:cs="Calibri"/>
-          <w:b/>
-          <w:bCs/>
-        </w:rPr>
-        <w:t>,</w:t>
-      </w:r>
-      <w:r>
-        <w:rPr>
-          <w:rFonts w:ascii="Calibri" w:hAnsi="Calibri" w:cs="Calibri"/>
-        </w:rPr>
-        <w:t xml:space="preserve"> manteniendo una estética gráfica y editorial. Las esquinas por defecto tienen un </w:t>
-      </w:r>
-      <w:r>
-        <w:rPr>
-          <w:rStyle w:val="Textoennegrita"/>
+          <w:sz w:val="24"/>
+          <w:szCs w:val="24"/>
+        </w:rPr>
+      </w:pPr>
+      <w:r>
+        <w:rPr>
           <w:rFonts w:ascii="Calibri" w:hAnsi="Calibri" w:cs="Calibri"/>
           <w:b w:val="0"/>
           <w:bCs w:val="0"/>
-        </w:rPr>
-        <w:t>radio de 0 px</w:t>
-      </w:r>
-      <w:r>
-        <w:rPr>
-          <w:rFonts w:ascii="Calibri" w:hAnsi="Calibri" w:cs="Calibri"/>
-          <w:b/>
-          <w:bCs/>
-        </w:rPr>
-        <w:t>,</w:t>
-      </w:r>
-      <w:r>
-        <w:rPr>
-          <w:rFonts w:ascii="Calibri" w:hAnsi="Calibri" w:cs="Calibri"/>
-        </w:rPr>
-        <w:t xml:space="preserve"> especialmente en imágenes, bloques de contenido, galerías y secciones principales. En elementos interactivos pequeños puedo utilizar un redondeo sutil de </w:t>
-      </w:r>
-      <w:r>
-        <w:rPr>
-          <w:rStyle w:val="Textoennegrita"/>
+          <w:sz w:val="24"/>
+          <w:szCs w:val="24"/>
+        </w:rPr>
+        <w:t>Necesito que en el header elimines los textos de marca publicidad editorial y 3d y solo dejes colores, tipografia, formas y componentes como botones con bordes redondeados y que al momento de presionarlos cambien de tono de azul</w:t>
+      </w:r>
+    </w:p>
+    <w:p>
+      <w:pPr>
+        <w:pStyle w:val="Fuerte1"/>
+        <w:rPr>
+          <w:rStyle w:val="Textoennegrita"/>
+          <w:rFonts w:ascii="Calibri" w:hAnsi="Calibri" w:cs="Calibri"/>
+          <w:sz w:val="24"/>
+          <w:szCs w:val="24"/>
+        </w:rPr>
+      </w:pPr>
+      <w:r>
+        <w:rPr>
           <w:rFonts w:ascii="Calibri" w:hAnsi="Calibri" w:cs="Calibri"/>
           <w:b w:val="0"/>
           <w:bCs w:val="0"/>
-        </w:rPr>
-        <w:t>4 px</w:t>
-      </w:r>
-      <w:r>
-        <w:rPr>
-          <w:rFonts w:ascii="Calibri" w:hAnsi="Calibri" w:cs="Calibri"/>
-        </w:rPr>
-        <w:t xml:space="preserve">, mientras que los botones y etiquetas pueden tener un radio máximo de </w:t>
-      </w:r>
-      <w:r>
-        <w:rPr>
-          <w:rStyle w:val="Textoennegrita"/>
-          <w:rFonts w:ascii="Calibri" w:hAnsi="Calibri" w:cs="Calibri"/>
-          <w:b w:val="0"/>
-          <w:bCs w:val="0"/>
-        </w:rPr>
-        <w:t>8 px</w:t>
-      </w:r>
-      <w:r>
-        <w:rPr>
-          <w:rFonts w:ascii="Calibri" w:hAnsi="Calibri" w:cs="Calibri"/>
-          <w:b/>
-          <w:bCs/>
+          <w:sz w:val="24"/>
+          <w:szCs w:val="24"/>
+        </w:rPr>
+        <w:t>necesito que en el header generes otro boton que diga si/no</w:t>
+      </w:r>
+    </w:p>
+    <w:p>
+      <w:pPr>
+        <w:pStyle w:val="NormalWeb"/>
+        <w:rPr>
+          <w:rFonts w:ascii="Calibri" w:hAnsi="Calibri" w:cs="Calibri"/>
+        </w:rPr>
+      </w:pPr>
+      <w:r>
+        <w:rPr>
+          <w:rFonts w:ascii="Calibri" w:hAnsi="Calibri" w:cs="Calibri"/>
+        </w:rPr>
+        <w:t>También debe permitir explorar directamente las categorías:</w:t>
+      </w:r>
+      <w:r>
+        <w:rPr>
+          <w:rFonts w:ascii="Calibri" w:hAnsi="Calibri" w:cs="Calibri"/>
+        </w:rPr>
+        <w:t xml:space="preserve"> </w:t>
+      </w:r>
+      <w:r>
+        <w:rPr>
+          <w:rStyle w:val="Textoennegrita"/>
+          <w:rFonts w:ascii="Calibri" w:hAnsi="Calibri" w:cs="Calibri"/>
+        </w:rPr>
+        <w:t>Marca</w:t>
+      </w:r>
+      <w:r>
+        <w:rPr>
+          <w:rStyle w:val="Textoennegrita"/>
+          <w:rFonts w:ascii="Calibri" w:hAnsi="Calibri" w:cs="Calibri"/>
+        </w:rPr>
+        <w:t xml:space="preserve">, </w:t>
+      </w:r>
+      <w:r>
+        <w:rPr>
+          <w:rStyle w:val="Textoennegrita"/>
+          <w:rFonts w:ascii="Calibri" w:hAnsi="Calibri" w:cs="Calibri"/>
+        </w:rPr>
+        <w:t>Publicidad</w:t>
+      </w:r>
+      <w:r>
+        <w:rPr>
+          <w:rStyle w:val="Textoennegrita"/>
+          <w:rFonts w:ascii="Calibri" w:hAnsi="Calibri" w:cs="Calibri"/>
+        </w:rPr>
+        <w:t xml:space="preserve">, </w:t>
+      </w:r>
+      <w:r>
+        <w:rPr>
+          <w:rStyle w:val="Textoennegrita"/>
+          <w:rFonts w:ascii="Calibri" w:hAnsi="Calibri" w:cs="Calibri"/>
+        </w:rPr>
+        <w:t>Editorial</w:t>
+      </w:r>
+      <w:r>
+        <w:rPr>
+          <w:rStyle w:val="Textoennegrita"/>
+          <w:rFonts w:ascii="Calibri" w:hAnsi="Calibri" w:cs="Calibri"/>
+        </w:rPr>
+        <w:t xml:space="preserve">, </w:t>
+      </w:r>
+      <w:r>
+        <w:rPr>
+          <w:rStyle w:val="Textoennegrita"/>
+          <w:rFonts w:ascii="Calibri" w:hAnsi="Calibri" w:cs="Calibri"/>
+        </w:rPr>
+        <w:t>Modelado 3D</w:t>
+      </w:r>
+      <w:r>
+        <w:rPr>
+          <w:rFonts w:ascii="Calibri" w:hAnsi="Calibri" w:cs="Calibri"/>
         </w:rPr>
         <w:t xml:space="preserve">. </w:t>
       </w:r>
@@ -1548,7 +2044,7 @@
         <w:rPr>
           <w:rFonts w:ascii="Calibri" w:hAnsi="Calibri" w:cs="Calibri"/>
         </w:rPr>
-        <w:t>Evito radios mayores porque las formas excesivamente redondeadas no corresponden con la personalidad visual de mi portafolio.</w:t>
+        <w:t>En escritorio puede permanecer visible en la parte superior. En móvil se transforma en un menú compacto.</w:t>
       </w:r>
     </w:p>
     <w:p>
@@ -1562,173 +2058,183 @@
         <w:rPr>
           <w:rFonts w:ascii="Calibri" w:hAnsi="Calibri" w:cs="Calibri"/>
         </w:rPr>
-        <w:t xml:space="preserve">La </w:t>
-      </w:r>
-      <w:r>
-        <w:rPr>
-          <w:rStyle w:val="Textoennegrita"/>
-          <w:rFonts w:ascii="Calibri" w:hAnsi="Calibri" w:cs="Calibri"/>
-          <w:b w:val="0"/>
-          <w:bCs w:val="0"/>
-        </w:rPr>
-        <w:t>estrella de cinco puntas</w:t>
-      </w:r>
-      <w:r>
-        <w:rPr>
-          <w:rFonts w:ascii="Calibri" w:hAnsi="Calibri" w:cs="Calibri"/>
-        </w:rPr>
-        <w:t xml:space="preserve"> funciona como uno de los recursos gráficos característicos de mi identidad, como ya aparece en la portada y otros elementos de tu portafolio. portafolio 2026 En escritorio, una estrella decorativa principal puede medir aproximadamente </w:t>
-      </w:r>
-      <w:r>
-        <w:rPr>
-          <w:rStyle w:val="Textoennegrita"/>
-          <w:rFonts w:ascii="Calibri" w:hAnsi="Calibri" w:cs="Calibri"/>
-          <w:b w:val="0"/>
-          <w:bCs w:val="0"/>
-        </w:rPr>
-        <w:t>48 × 48 px</w:t>
-      </w:r>
-      <w:r>
-        <w:rPr>
-          <w:rFonts w:ascii="Calibri" w:hAnsi="Calibri" w:cs="Calibri"/>
-          <w:b/>
-          <w:bCs/>
-        </w:rPr>
-        <w:t>,</w:t>
-      </w:r>
-      <w:r>
-        <w:rPr>
-          <w:rFonts w:ascii="Calibri" w:hAnsi="Calibri" w:cs="Calibri"/>
-        </w:rPr>
-        <w:t xml:space="preserve"> mientras que las estrellas secundarias pueden variar entre </w:t>
-      </w:r>
-      <w:r>
-        <w:rPr>
-          <w:rStyle w:val="Textoennegrita"/>
-          <w:rFonts w:ascii="Calibri" w:hAnsi="Calibri" w:cs="Calibri"/>
-          <w:b w:val="0"/>
-          <w:bCs w:val="0"/>
-        </w:rPr>
-        <w:t>24 × 24 px y 32 × 32 px</w:t>
-      </w:r>
-      <w:r>
-        <w:rPr>
-          <w:rFonts w:ascii="Calibri" w:hAnsi="Calibri" w:cs="Calibri"/>
-        </w:rPr>
-        <w:t xml:space="preserve">. Para detalles pequeños o indicadores utilizo estrellas de </w:t>
-      </w:r>
-      <w:r>
-        <w:rPr>
-          <w:rStyle w:val="Textoennegrita"/>
-          <w:rFonts w:ascii="Calibri" w:hAnsi="Calibri" w:cs="Calibri"/>
-          <w:b w:val="0"/>
-          <w:bCs w:val="0"/>
-        </w:rPr>
-        <w:t>16 × 16 px</w:t>
-      </w:r>
-      <w:r>
-        <w:rPr>
-          <w:rFonts w:ascii="Calibri" w:hAnsi="Calibri" w:cs="Calibri"/>
-          <w:b/>
-          <w:bCs/>
-        </w:rPr>
-        <w:t>.</w:t>
-      </w:r>
-      <w:r>
-        <w:rPr>
-          <w:rFonts w:ascii="Calibri" w:hAnsi="Calibri" w:cs="Calibri"/>
-        </w:rPr>
-        <w:t xml:space="preserve"> En composiciones especiales o fondos, una estrella puede aumentar hasta </w:t>
-      </w:r>
-      <w:r>
-        <w:rPr>
-          <w:rStyle w:val="Textoennegrita"/>
-          <w:rFonts w:ascii="Calibri" w:hAnsi="Calibri" w:cs="Calibri"/>
-          <w:b w:val="0"/>
-          <w:bCs w:val="0"/>
-        </w:rPr>
-        <w:t>80–120 px</w:t>
-      </w:r>
-      <w:r>
-        <w:rPr>
-          <w:rFonts w:ascii="Calibri" w:hAnsi="Calibri" w:cs="Calibri"/>
-          <w:b/>
-          <w:bCs/>
-        </w:rPr>
-        <w:t>,</w:t>
-      </w:r>
-      <w:r>
-        <w:rPr>
-          <w:rFonts w:ascii="Calibri" w:hAnsi="Calibri" w:cs="Calibri"/>
-        </w:rPr>
-        <w:t xml:space="preserve"> siempre que no interfiera con la lectura ni compita con los proyectos.</w:t>
-      </w:r>
-    </w:p>
-    <w:p>
-      <w:pPr>
-        <w:pStyle w:val="NormalWeb"/>
-        <w:rPr>
-          <w:rFonts w:ascii="Calibri" w:hAnsi="Calibri" w:cs="Calibri"/>
-        </w:rPr>
-      </w:pPr>
-      <w:r>
-        <w:rPr>
-          <w:rFonts w:ascii="Calibri" w:hAnsi="Calibri" w:cs="Calibri"/>
-        </w:rPr>
-        <w:t xml:space="preserve">Las </w:t>
-      </w:r>
-      <w:r>
-        <w:rPr>
-          <w:rStyle w:val="Textoennegrita"/>
-          <w:rFonts w:ascii="Calibri" w:hAnsi="Calibri" w:cs="Calibri"/>
-          <w:b w:val="0"/>
-          <w:bCs w:val="0"/>
-        </w:rPr>
-        <w:t>líneas decorativas</w:t>
-      </w:r>
-      <w:r>
-        <w:rPr>
-          <w:rFonts w:ascii="Calibri" w:hAnsi="Calibri" w:cs="Calibri"/>
-        </w:rPr>
-        <w:t xml:space="preserve"> que acompañan títulos o estrellas deben tener un grosor de </w:t>
-      </w:r>
-      <w:r>
-        <w:rPr>
-          <w:rStyle w:val="Textoennegrita"/>
-          <w:rFonts w:ascii="Calibri" w:hAnsi="Calibri" w:cs="Calibri"/>
-          <w:b w:val="0"/>
-          <w:bCs w:val="0"/>
-        </w:rPr>
-        <w:t>1–2 px</w:t>
-      </w:r>
-      <w:r>
-        <w:rPr>
-          <w:rFonts w:ascii="Calibri" w:hAnsi="Calibri" w:cs="Calibri"/>
-        </w:rPr>
-        <w:t xml:space="preserve"> y pueden extenderse entre </w:t>
-      </w:r>
-      <w:r>
-        <w:rPr>
-          <w:rStyle w:val="Textoennegrita"/>
-          <w:rFonts w:ascii="Calibri" w:hAnsi="Calibri" w:cs="Calibri"/>
-          <w:b w:val="0"/>
-          <w:bCs w:val="0"/>
-        </w:rPr>
-        <w:t>80 y 200 px</w:t>
-      </w:r>
-      <w:r>
-        <w:rPr>
-          <w:rFonts w:ascii="Calibri" w:hAnsi="Calibri" w:cs="Calibri"/>
-          <w:b/>
-          <w:bCs/>
-        </w:rPr>
-        <w:t>,</w:t>
-      </w:r>
-      <w:r>
-        <w:rPr>
-          <w:rFonts w:ascii="Calibri" w:hAnsi="Calibri" w:cs="Calibri"/>
-        </w:rPr>
-        <w:t xml:space="preserve"> dependiendo de la composición.</w:t>
+        <w:lastRenderedPageBreak/>
+        <w:t xml:space="preserve">En </w:t>
+      </w:r>
+      <w:r>
+        <w:rPr>
+          <w:rFonts w:ascii="Calibri" w:hAnsi="Calibri" w:cs="Calibri"/>
+        </w:rPr>
+        <w:t>el encabezado pongas el jpg de @assets/img/fondo encabezado.png</w:t>
+      </w:r>
+    </w:p>
+    <w:p>
+      <w:pPr>
+        <w:pStyle w:val="Ttulo3"/>
+        <w:rPr>
+          <w:rFonts w:ascii="Calibri" w:hAnsi="Calibri" w:cs="Calibri"/>
+          <w:b/>
+          <w:bCs/>
+        </w:rPr>
+      </w:pPr>
+      <w:r>
+        <w:rPr>
+          <w:rFonts w:ascii="Calibri" w:hAnsi="Calibri" w:cs="Calibri"/>
+          <w:b/>
+          <w:bCs/>
+        </w:rPr>
+        <w:t>Botones</w:t>
+      </w:r>
+    </w:p>
+    <w:p>
+      <w:pPr>
+        <w:rPr>
+          <w:rFonts w:ascii="Calibri" w:hAnsi="Calibri" w:cs="Calibri"/>
+          <w:sz w:val="24"/>
+          <w:szCs w:val="24"/>
+        </w:rPr>
+      </w:pPr>
+      <w:r>
+        <w:rPr>
+          <w:rFonts w:ascii="Calibri" w:hAnsi="Calibri" w:cs="Calibri"/>
+          <w:sz w:val="24"/>
+          <w:szCs w:val="24"/>
+        </w:rPr>
+        <w:t>Los botones y enlaces de acción tienen base oscura, borde claro y efecto luminoso azul en hover, foco y activación. Los filtros de categoría son botones redondeados que mantienen aria-pressed según la selección. El botón Ver proyecto conserva un contorno luminoso al interactuar, mientras la tarjeta permanece estable.</w:t>
+      </w:r>
+    </w:p>
+    <w:p>
+      <w:pPr>
+        <w:rPr>
+          <w:rFonts w:ascii="Calibri" w:hAnsi="Calibri" w:cs="Calibri"/>
+          <w:sz w:val="24"/>
+          <w:szCs w:val="24"/>
+        </w:rPr>
+      </w:pPr>
+      <w:r>
+        <w:rPr>
+          <w:rFonts w:ascii="Calibri" w:hAnsi="Calibri" w:cs="Calibri"/>
+          <w:sz w:val="24"/>
+          <w:szCs w:val="24"/>
+        </w:rPr>
+        <w:t>El botón de menú móvil cambia aria-expanded. Los enlaces de navegación registran aria-current al seleccionarse. Se utiliza foco visible para navegación por teclado.</w:t>
+      </w:r>
+    </w:p>
+    <w:p>
+      <w:pPr>
+        <w:rPr>
+          <w:rFonts w:ascii="Calibri" w:hAnsi="Calibri" w:cs="Calibri"/>
+          <w:sz w:val="24"/>
+          <w:szCs w:val="24"/>
+        </w:rPr>
+      </w:pPr>
+    </w:p>
+    <w:p>
+      <w:pPr>
+        <w:pStyle w:val="Ttulo3"/>
+        <w:rPr>
+          <w:rFonts w:ascii="Calibri" w:hAnsi="Calibri" w:cs="Calibri"/>
+          <w:b/>
+          <w:bCs/>
+        </w:rPr>
+      </w:pPr>
+      <w:r>
+        <w:rPr>
+          <w:rFonts w:ascii="Calibri" w:hAnsi="Calibri" w:cs="Calibri"/>
+          <w:b/>
+          <w:bCs/>
+        </w:rPr>
+        <w:t>Tarjetas de proyecto</w:t>
+      </w:r>
+    </w:p>
+    <w:p>
+      <w:pPr>
+        <w:rPr>
+          <w:rFonts w:ascii="Calibri" w:hAnsi="Calibri" w:cs="Calibri"/>
+          <w:sz w:val="24"/>
+          <w:szCs w:val="24"/>
+        </w:rPr>
+      </w:pPr>
+      <w:r>
+        <w:rPr>
+          <w:rFonts w:ascii="Calibri" w:hAnsi="Calibri" w:cs="Calibri"/>
+          <w:sz w:val="24"/>
+          <w:szCs w:val="24"/>
+        </w:rPr>
+        <w:t>Las tarjetas de proyecto poseen fondo oscuro, borde tenue, imagen superior y texto descriptivo siempre visible debajo. A diferencia de la propuesta original, no aparece una capa oscura sobre la imagen en hover en el diseño efectivo: el foco visual se traslada al botón Ver proyecto.</w:t>
+      </w:r>
+    </w:p>
+    <w:p>
+      <w:pPr>
+        <w:rPr>
+          <w:rFonts w:ascii="Calibri" w:hAnsi="Calibri" w:cs="Calibri"/>
+          <w:sz w:val="24"/>
+          <w:szCs w:val="24"/>
+        </w:rPr>
+      </w:pPr>
+      <w:r>
+        <w:rPr>
+          <w:rFonts w:ascii="Calibri" w:hAnsi="Calibri" w:cs="Calibri"/>
+          <w:sz w:val="24"/>
+          <w:szCs w:val="24"/>
+        </w:rPr>
+        <w:t>El detalle presenta fondo negro, título blanco y una galería de tarjetas con textura oscura, borde azulado, reflejo al hover y estrella decorativa. Las imágenes se muestran cuadradas (aspect-ratio 1/1, object-fit: cover), por lo que puede haber recorte en miniatura; el visor modal muestra la imagen completa con object-fit: contain.</w:t>
+      </w:r>
+    </w:p>
+    <w:p>
+      <w:pPr>
+        <w:pStyle w:val="Ttulo3"/>
+        <w:rPr>
+          <w:rFonts w:ascii="Calibri" w:hAnsi="Calibri" w:cs="Calibri"/>
+          <w:b/>
+          <w:bCs/>
+        </w:rPr>
+      </w:pPr>
+    </w:p>
+    <w:p>
+      <w:pPr>
+        <w:pStyle w:val="Ttulo3"/>
+        <w:rPr>
+          <w:rFonts w:ascii="Calibri" w:hAnsi="Calibri" w:cs="Calibri"/>
+          <w:b/>
+          <w:bCs/>
+        </w:rPr>
+      </w:pPr>
+      <w:r>
+        <w:rPr>
+          <w:rFonts w:ascii="Calibri" w:hAnsi="Calibri" w:cs="Calibri"/>
+          <w:b/>
+          <w:bCs/>
+        </w:rPr>
+        <w:t>Separadores de categoría</w:t>
+      </w:r>
+    </w:p>
+    <w:p>
+      <w:pPr>
+        <w:pStyle w:val="Ttulo3"/>
+        <w:rPr>
+          <w:rFonts w:ascii="Calibri" w:hAnsi="Calibri" w:cs="Calibri"/>
+          <w:b/>
+          <w:bCs/>
+        </w:rPr>
+      </w:pPr>
+    </w:p>
+    <w:p>
+      <w:pPr>
+        <w:pStyle w:val="Ttulo3"/>
+        <w:rPr>
+          <w:rFonts w:ascii="Calibri" w:hAnsi="Calibri" w:cs="Calibri"/>
+          <w:b/>
+          <w:bCs/>
+          <w:color w:val="000000" w:themeColor="text1"/>
+        </w:rPr>
+      </w:pPr>
+      <w:r>
+        <w:rPr>
+          <w:rFonts w:ascii="Calibri" w:hAnsi="Calibri" w:cs="Calibri"/>
+          <w:color w:val="000000" w:themeColor="text1"/>
+        </w:rPr>
+        <w:t>Sobre mí combina fotografía a sangre con texto, estrellas y banda móvil. Habilidades muestra cuatro columnas editoriales numeradas con separadores verticales. Educación utiliza un bloque con línea lateral y estrella. Experiencia se distribuye en tres tarjetas con resplandor al interactuar. Contacto usa título luminoso y tres columnas centradas.</w:t>
       </w:r>
     </w:p>
     <w:p>
@@ -1736,533 +2242,19 @@
         <w:pStyle w:val="Ttulo1"/>
         <w:spacing w:before="340" w:after="120"/>
         <w:rPr>
+          <w:rFonts w:ascii="Calibri" w:hAnsi="Calibri" w:cs="Calibri"/>
+          <w:sz w:val="24"/>
+          <w:szCs w:val="24"/>
+        </w:rPr>
+      </w:pPr>
+      <w:r>
+        <w:rPr>
           <w:rFonts w:ascii="Calibri" w:eastAsia="Calibri" w:hAnsi="Calibri" w:cs="Calibri"/>
           <w:b/>
           <w:bCs/>
           <w:color w:val="202225"/>
-        </w:rPr>
-      </w:pPr>
-      <w:r>
-        <w:rPr>
-          <w:rFonts w:ascii="Calibri" w:eastAsia="Calibri" w:hAnsi="Calibri" w:cs="Calibri"/>
-          <w:b/>
-          <w:bCs/>
-          <w:color w:val="202225"/>
-        </w:rPr>
-        <w:lastRenderedPageBreak/>
-        <w:t>7</w:t>
-      </w:r>
-      <w:r>
-        <w:rPr>
-          <w:rFonts w:ascii="Calibri" w:eastAsia="Calibri" w:hAnsi="Calibri" w:cs="Calibri"/>
-          <w:b/>
-          <w:bCs/>
-          <w:color w:val="202225"/>
-        </w:rPr>
-        <w:t xml:space="preserve"> · Componentes</w:t>
-      </w:r>
-    </w:p>
-    <w:p>
-      <w:pPr>
-        <w:pStyle w:val="Ttulo3"/>
-        <w:rPr>
-          <w:rFonts w:ascii="Calibri" w:hAnsi="Calibri" w:cs="Calibri"/>
-          <w:b/>
-          <w:bCs/>
-        </w:rPr>
-      </w:pPr>
-      <w:r>
-        <w:rPr>
-          <w:rFonts w:ascii="Calibri" w:hAnsi="Calibri" w:cs="Calibri"/>
-          <w:b/>
-          <w:bCs/>
-        </w:rPr>
-        <w:t>Navegación</w:t>
-      </w:r>
-    </w:p>
-    <w:p>
-      <w:pPr>
-        <w:pStyle w:val="NormalWeb"/>
-        <w:rPr>
-          <w:rStyle w:val="Textoennegrita"/>
-          <w:rFonts w:ascii="Calibri" w:hAnsi="Calibri" w:cs="Calibri"/>
-        </w:rPr>
-      </w:pPr>
-      <w:r>
-        <w:rPr>
-          <w:rFonts w:ascii="Calibri" w:hAnsi="Calibri" w:cs="Calibri"/>
-        </w:rPr>
-        <w:t>La navegación debe ser sencilla y permanecer visualmente limpia</w:t>
-      </w:r>
-      <w:r>
-        <w:rPr>
-          <w:rFonts w:ascii="Calibri" w:hAnsi="Calibri" w:cs="Calibri"/>
-        </w:rPr>
-        <w:t>, incluye:</w:t>
-      </w:r>
-      <w:r>
-        <w:rPr>
-          <w:rStyle w:val="Textoennegrita"/>
-          <w:rFonts w:ascii="Calibri" w:hAnsi="Calibri" w:cs="Calibri"/>
-        </w:rPr>
-        <w:t>Inicio</w:t>
-      </w:r>
-      <w:r>
-        <w:rPr>
-          <w:rStyle w:val="Textoennegrita"/>
-          <w:rFonts w:ascii="Calibri" w:hAnsi="Calibri" w:cs="Calibri"/>
-        </w:rPr>
-        <w:t xml:space="preserve">, </w:t>
-      </w:r>
-      <w:r>
-        <w:rPr>
-          <w:rStyle w:val="Textoennegrita"/>
-          <w:rFonts w:ascii="Calibri" w:hAnsi="Calibri" w:cs="Calibri"/>
-        </w:rPr>
-        <w:t>Sobre mí</w:t>
-      </w:r>
-      <w:r>
-        <w:rPr>
-          <w:rStyle w:val="Textoennegrita"/>
-          <w:rFonts w:ascii="Calibri" w:hAnsi="Calibri" w:cs="Calibri"/>
-        </w:rPr>
-        <w:t xml:space="preserve">, </w:t>
-      </w:r>
-      <w:r>
-        <w:rPr>
-          <w:rStyle w:val="Textoennegrita"/>
-          <w:rFonts w:ascii="Calibri" w:hAnsi="Calibri" w:cs="Calibri"/>
-        </w:rPr>
-        <w:t>Proyectos</w:t>
-      </w:r>
-      <w:r>
-        <w:rPr>
-          <w:rStyle w:val="Textoennegrita"/>
-          <w:rFonts w:ascii="Calibri" w:hAnsi="Calibri" w:cs="Calibri"/>
-        </w:rPr>
-        <w:t xml:space="preserve">, </w:t>
-      </w:r>
-      <w:r>
-        <w:rPr>
-          <w:rStyle w:val="Textoennegrita"/>
-          <w:rFonts w:ascii="Calibri" w:hAnsi="Calibri" w:cs="Calibri"/>
-        </w:rPr>
-        <w:t>Contacto</w:t>
-      </w:r>
-    </w:p>
-    <w:p>
-      <w:pPr>
-        <w:pStyle w:val="Fuerte1"/>
-        <w:rPr>
-          <w:rFonts w:ascii="Calibri" w:hAnsi="Calibri" w:cs="Calibri"/>
-          <w:b w:val="0"/>
-          <w:bCs w:val="0"/>
-          <w:sz w:val="24"/>
-          <w:szCs w:val="24"/>
-        </w:rPr>
-      </w:pPr>
-      <w:r>
-        <w:rPr>
-          <w:rFonts w:ascii="Calibri" w:hAnsi="Calibri" w:cs="Calibri"/>
-          <w:b w:val="0"/>
-          <w:bCs w:val="0"/>
-          <w:sz w:val="24"/>
-          <w:szCs w:val="24"/>
-        </w:rPr>
-        <w:t>Necesito que en el header elimines los textos de marca publicidad editorial y 3d y solo dejes colores, tipografia, formas y componentes como botones con bordes redondeados y que al momento de presionarlos cambien de tono de azul</w:t>
-      </w:r>
-    </w:p>
-    <w:p>
-      <w:pPr>
-        <w:pStyle w:val="Fuerte1"/>
-        <w:rPr>
-          <w:rStyle w:val="Textoennegrita"/>
-          <w:rFonts w:ascii="Calibri" w:hAnsi="Calibri" w:cs="Calibri"/>
-          <w:sz w:val="24"/>
-          <w:szCs w:val="24"/>
-        </w:rPr>
-      </w:pPr>
-      <w:r>
-        <w:rPr>
-          <w:rFonts w:ascii="Calibri" w:hAnsi="Calibri" w:cs="Calibri"/>
-          <w:b w:val="0"/>
-          <w:bCs w:val="0"/>
-          <w:sz w:val="24"/>
-          <w:szCs w:val="24"/>
-        </w:rPr>
-        <w:t>necesito que en el header generes otro boton que diga si/no</w:t>
-      </w:r>
-    </w:p>
-    <w:p>
-      <w:pPr>
-        <w:pStyle w:val="NormalWeb"/>
-        <w:rPr>
-          <w:rFonts w:ascii="Calibri" w:hAnsi="Calibri" w:cs="Calibri"/>
-        </w:rPr>
-      </w:pPr>
-      <w:r>
-        <w:rPr>
-          <w:rFonts w:ascii="Calibri" w:hAnsi="Calibri" w:cs="Calibri"/>
-        </w:rPr>
-        <w:t>También debe permitir explorar directamente las categorías:</w:t>
-      </w:r>
-      <w:r>
-        <w:rPr>
-          <w:rFonts w:ascii="Calibri" w:hAnsi="Calibri" w:cs="Calibri"/>
-        </w:rPr>
-        <w:t xml:space="preserve"> </w:t>
-      </w:r>
-      <w:r>
-        <w:rPr>
-          <w:rStyle w:val="Textoennegrita"/>
-          <w:rFonts w:ascii="Calibri" w:hAnsi="Calibri" w:cs="Calibri"/>
-        </w:rPr>
-        <w:t>Marca</w:t>
-      </w:r>
-      <w:r>
-        <w:rPr>
-          <w:rStyle w:val="Textoennegrita"/>
-          <w:rFonts w:ascii="Calibri" w:hAnsi="Calibri" w:cs="Calibri"/>
-        </w:rPr>
-        <w:t xml:space="preserve">, </w:t>
-      </w:r>
-      <w:r>
-        <w:rPr>
-          <w:rStyle w:val="Textoennegrita"/>
-          <w:rFonts w:ascii="Calibri" w:hAnsi="Calibri" w:cs="Calibri"/>
-        </w:rPr>
-        <w:t>Publicidad</w:t>
-      </w:r>
-      <w:r>
-        <w:rPr>
-          <w:rStyle w:val="Textoennegrita"/>
-          <w:rFonts w:ascii="Calibri" w:hAnsi="Calibri" w:cs="Calibri"/>
-        </w:rPr>
-        <w:t xml:space="preserve">, </w:t>
-      </w:r>
-      <w:r>
-        <w:rPr>
-          <w:rStyle w:val="Textoennegrita"/>
-          <w:rFonts w:ascii="Calibri" w:hAnsi="Calibri" w:cs="Calibri"/>
-        </w:rPr>
-        <w:t>Editorial</w:t>
-      </w:r>
-      <w:r>
-        <w:rPr>
-          <w:rStyle w:val="Textoennegrita"/>
-          <w:rFonts w:ascii="Calibri" w:hAnsi="Calibri" w:cs="Calibri"/>
-        </w:rPr>
-        <w:t xml:space="preserve">, </w:t>
-      </w:r>
-      <w:r>
-        <w:rPr>
-          <w:rStyle w:val="Textoennegrita"/>
-          <w:rFonts w:ascii="Calibri" w:hAnsi="Calibri" w:cs="Calibri"/>
-        </w:rPr>
-        <w:t>Modelado 3D</w:t>
-      </w:r>
-      <w:r>
-        <w:rPr>
-          <w:rFonts w:ascii="Calibri" w:hAnsi="Calibri" w:cs="Calibri"/>
-        </w:rPr>
-        <w:t xml:space="preserve">. </w:t>
-      </w:r>
-      <w:r>
-        <w:rPr>
-          <w:rFonts w:ascii="Calibri" w:hAnsi="Calibri" w:cs="Calibri"/>
-        </w:rPr>
-        <w:t>En escritorio puede permanecer visible en la parte superior. En móvil se transforma en un menú compacto.</w:t>
-      </w:r>
-    </w:p>
-    <w:p>
-      <w:pPr>
-        <w:pStyle w:val="NormalWeb"/>
-        <w:rPr>
-          <w:rFonts w:ascii="Calibri" w:hAnsi="Calibri" w:cs="Calibri"/>
-        </w:rPr>
-      </w:pPr>
-      <w:r>
-        <w:rPr>
-          <w:rFonts w:ascii="Calibri" w:hAnsi="Calibri" w:cs="Calibri"/>
-        </w:rPr>
-        <w:t xml:space="preserve">En </w:t>
-      </w:r>
-      <w:r>
-        <w:rPr>
-          <w:rFonts w:ascii="Calibri" w:hAnsi="Calibri" w:cs="Calibri"/>
-        </w:rPr>
-        <w:t>el encabezado pongas el jpg de @assets/img/fondo encabezado.png</w:t>
-      </w:r>
-    </w:p>
-    <w:p>
-      <w:pPr>
-        <w:pStyle w:val="Ttulo3"/>
-        <w:rPr>
-          <w:rFonts w:ascii="Calibri" w:hAnsi="Calibri" w:cs="Calibri"/>
-          <w:b/>
-          <w:bCs/>
-        </w:rPr>
-      </w:pPr>
-      <w:r>
-        <w:rPr>
-          <w:rFonts w:ascii="Calibri" w:hAnsi="Calibri" w:cs="Calibri"/>
-          <w:b/>
-          <w:bCs/>
-        </w:rPr>
-        <w:t>Botones</w:t>
-      </w:r>
-    </w:p>
-    <w:p>
-      <w:pPr>
-        <w:pStyle w:val="NormalWeb"/>
-        <w:rPr>
-          <w:rFonts w:ascii="Calibri" w:hAnsi="Calibri" w:cs="Calibri"/>
-        </w:rPr>
-      </w:pPr>
-      <w:r>
-        <w:rPr>
-          <w:rFonts w:ascii="Calibri" w:hAnsi="Calibri" w:cs="Calibri"/>
-        </w:rPr>
-        <w:t xml:space="preserve">El botón principal utiliza </w:t>
-      </w:r>
-      <w:r>
-        <w:rPr>
-          <w:rStyle w:val="Textoennegrita"/>
-          <w:rFonts w:ascii="Calibri" w:hAnsi="Calibri" w:cs="Calibri"/>
-        </w:rPr>
-        <w:t>azul eléctrico con texto blanco</w:t>
-      </w:r>
-      <w:r>
-        <w:rPr>
-          <w:rFonts w:ascii="Calibri" w:hAnsi="Calibri" w:cs="Calibri"/>
-        </w:rPr>
-        <w:t>, tipografía bold y mayúsculas</w:t>
-      </w:r>
-      <w:r>
-        <w:rPr>
-          <w:rFonts w:ascii="Calibri" w:hAnsi="Calibri" w:cs="Calibri"/>
-        </w:rPr>
-        <w:t xml:space="preserve">, </w:t>
-      </w:r>
-      <w:r>
-        <w:rPr>
-          <w:rFonts w:ascii="Calibri" w:hAnsi="Calibri" w:cs="Calibri"/>
-        </w:rPr>
-        <w:t>Los botones secundarios pueden utilizar fondo transparente, borde azul y texto azul</w:t>
-      </w:r>
-      <w:r>
-        <w:rPr>
-          <w:rFonts w:ascii="Calibri" w:hAnsi="Calibri" w:cs="Calibri"/>
-        </w:rPr>
-        <w:t xml:space="preserve">, </w:t>
-      </w:r>
-      <w:r>
-        <w:rPr>
-          <w:rFonts w:ascii="Calibri" w:hAnsi="Calibri" w:cs="Calibri"/>
-        </w:rPr>
-        <w:t>En hover, los botones pueden invertir sus colores o incorporar un pequeño desplazamiento.</w:t>
-      </w:r>
-    </w:p>
-    <w:p>
-      <w:pPr>
-        <w:pStyle w:val="Ttulo3"/>
-        <w:rPr>
-          <w:rFonts w:ascii="Calibri" w:hAnsi="Calibri" w:cs="Calibri"/>
-          <w:b/>
-          <w:bCs/>
-        </w:rPr>
-      </w:pPr>
-      <w:r>
-        <w:rPr>
-          <w:rFonts w:ascii="Calibri" w:hAnsi="Calibri" w:cs="Calibri"/>
-          <w:b/>
-          <w:bCs/>
-        </w:rPr>
-        <w:t>Tarjetas de proyecto</w:t>
-      </w:r>
-    </w:p>
-    <w:p>
-      <w:pPr>
-        <w:pStyle w:val="NormalWeb"/>
-        <w:rPr>
-          <w:rFonts w:ascii="Calibri" w:hAnsi="Calibri" w:cs="Calibri"/>
-        </w:rPr>
-      </w:pPr>
-      <w:r>
-        <w:rPr>
-          <w:rFonts w:ascii="Calibri" w:hAnsi="Calibri" w:cs="Calibri"/>
-        </w:rPr>
-        <w:t>Las tarjetas deben dar prioridad absoluta a la imagen</w:t>
-      </w:r>
-      <w:r>
-        <w:rPr>
-          <w:rFonts w:ascii="Calibri" w:hAnsi="Calibri" w:cs="Calibri"/>
-        </w:rPr>
-        <w:t>;</w:t>
-      </w:r>
-      <w:r>
-        <w:rPr>
-          <w:rFonts w:ascii="Calibri" w:hAnsi="Calibri" w:cs="Calibri"/>
-        </w:rPr>
-        <w:t>Por defecto muestran el proyecto de manera limpia. Al hacer hover puede aparecer:</w:t>
-      </w:r>
-      <w:r>
-        <w:rPr>
-          <w:rFonts w:ascii="Calibri" w:hAnsi="Calibri" w:cs="Calibri"/>
-        </w:rPr>
-        <w:t xml:space="preserve"> </w:t>
-      </w:r>
-      <w:r>
-        <w:rPr>
-          <w:rStyle w:val="Textoennegrita"/>
-          <w:rFonts w:ascii="Calibri" w:hAnsi="Calibri" w:cs="Calibri"/>
-          <w:b w:val="0"/>
-          <w:bCs w:val="0"/>
-        </w:rPr>
-        <w:t>Nombre del proyecto</w:t>
-      </w:r>
-      <w:r>
-        <w:rPr>
-          <w:rFonts w:ascii="Calibri" w:hAnsi="Calibri" w:cs="Calibri"/>
-          <w:b/>
-          <w:bCs/>
-        </w:rPr>
-        <w:t xml:space="preserve">, </w:t>
-      </w:r>
-      <w:r>
-        <w:rPr>
-          <w:rStyle w:val="Textoennegrita"/>
-          <w:rFonts w:ascii="Calibri" w:hAnsi="Calibri" w:cs="Calibri"/>
-          <w:b w:val="0"/>
-          <w:bCs w:val="0"/>
-        </w:rPr>
-        <w:t>Categoría</w:t>
-      </w:r>
-      <w:r>
-        <w:rPr>
-          <w:rFonts w:ascii="Calibri" w:hAnsi="Calibri" w:cs="Calibri"/>
-          <w:b/>
-          <w:bCs/>
-        </w:rPr>
-        <w:t xml:space="preserve">, </w:t>
-      </w:r>
-      <w:r>
-        <w:rPr>
-          <w:rStyle w:val="Textoennegrita"/>
-          <w:rFonts w:ascii="Calibri" w:hAnsi="Calibri" w:cs="Calibri"/>
-          <w:b w:val="0"/>
-          <w:bCs w:val="0"/>
-        </w:rPr>
-        <w:t>Año</w:t>
-      </w:r>
-      <w:r>
-        <w:rPr>
-          <w:rFonts w:ascii="Calibri" w:hAnsi="Calibri" w:cs="Calibri"/>
-          <w:b/>
-          <w:bCs/>
-        </w:rPr>
-        <w:t xml:space="preserve">, </w:t>
-      </w:r>
-      <w:r>
-        <w:rPr>
-          <w:rStyle w:val="Textoennegrita"/>
-          <w:rFonts w:ascii="Calibri" w:hAnsi="Calibri" w:cs="Calibri"/>
-          <w:b w:val="0"/>
-          <w:bCs w:val="0"/>
-        </w:rPr>
-        <w:t>Ver proyecto</w:t>
-      </w:r>
-      <w:r>
-        <w:rPr>
-          <w:rStyle w:val="Textoennegrita"/>
-          <w:rFonts w:ascii="Calibri" w:hAnsi="Calibri" w:cs="Calibri"/>
-          <w:b w:val="0"/>
-          <w:bCs w:val="0"/>
-        </w:rPr>
-        <w:t>,</w:t>
-      </w:r>
-      <w:r>
-        <w:rPr>
-          <w:rStyle w:val="Textoennegrita"/>
-          <w:rFonts w:ascii="Calibri" w:hAnsi="Calibri" w:cs="Calibri"/>
-        </w:rPr>
-        <w:t xml:space="preserve"> </w:t>
-      </w:r>
-      <w:r>
-        <w:rPr>
-          <w:rFonts w:ascii="Calibri" w:hAnsi="Calibri" w:cs="Calibri"/>
-        </w:rPr>
-        <w:t>La interacción puede incluir un ligero zoom de la imagen y aparición del texto.</w:t>
-      </w:r>
-    </w:p>
-    <w:p>
-      <w:pPr>
-        <w:pStyle w:val="Ttulo3"/>
-        <w:rPr>
-          <w:rFonts w:ascii="Calibri" w:hAnsi="Calibri" w:cs="Calibri"/>
-          <w:b/>
-          <w:bCs/>
-        </w:rPr>
-      </w:pPr>
-      <w:r>
-        <w:rPr>
-          <w:rFonts w:ascii="Calibri" w:hAnsi="Calibri" w:cs="Calibri"/>
-          <w:b/>
-          <w:bCs/>
-        </w:rPr>
-        <w:t>Separadores de categoría</w:t>
-      </w:r>
-    </w:p>
-    <w:p>
-      <w:pPr>
-        <w:pStyle w:val="NormalWeb"/>
-        <w:rPr>
-          <w:rFonts w:ascii="Calibri" w:hAnsi="Calibri" w:cs="Calibri"/>
-        </w:rPr>
-      </w:pPr>
-      <w:r>
-        <w:rPr>
-          <w:rFonts w:ascii="Calibri" w:hAnsi="Calibri" w:cs="Calibri"/>
-        </w:rPr>
-        <w:t>Las categorías principales utilizan una sección de fondo azul profundo con un título blanco de gran escala</w:t>
-      </w:r>
-      <w:r>
-        <w:rPr>
-          <w:rFonts w:ascii="Calibri" w:hAnsi="Calibri" w:cs="Calibri"/>
-        </w:rPr>
-        <w:t xml:space="preserve">, </w:t>
-      </w:r>
-      <w:r>
-        <w:rPr>
-          <w:rFonts w:ascii="Calibri" w:hAnsi="Calibri" w:cs="Calibri"/>
-        </w:rPr>
-        <w:t xml:space="preserve">Detrás del título aparece la misma palabra en </w:t>
-      </w:r>
-      <w:r>
-        <w:rPr>
-          <w:rStyle w:val="Textoennegrita"/>
-          <w:rFonts w:ascii="Calibri" w:hAnsi="Calibri" w:cs="Calibri"/>
-        </w:rPr>
-        <w:t>contorno azul claro o blanco</w:t>
-      </w:r>
-      <w:r>
-        <w:rPr>
-          <w:rFonts w:ascii="Calibri" w:hAnsi="Calibri" w:cs="Calibri"/>
-        </w:rPr>
-        <w:t>, generando el efecto visual utilizado actualmente en mi portafolio.</w:t>
-      </w:r>
-    </w:p>
-    <w:p>
-      <w:pPr>
-        <w:pStyle w:val="Ttulo1"/>
-        <w:spacing w:before="340" w:after="120"/>
-      </w:pPr>
-      <w:r>
-        <w:rPr>
-          <w:rFonts w:ascii="Calibri" w:eastAsia="Calibri" w:hAnsi="Calibri" w:cs="Calibri"/>
-          <w:b/>
-          <w:bCs/>
-          <w:color w:val="202225"/>
+          <w:sz w:val="24"/>
+          <w:szCs w:val="24"/>
         </w:rPr>
         <w:t>8 · Reglas (sí y no)</w:t>
       </w:r>
@@ -2532,15 +2524,7 @@
           <w:sz w:val="24"/>
           <w:szCs w:val="24"/>
         </w:rPr>
-        <w:t>No permitir que la identidad del sitio compita con los proyectos.</w:t>
-      </w:r>
-      <w:r>
-        <w:rPr>
-          <w:rFonts w:ascii="Calibri" w:hAnsi="Calibri" w:cs="Calibri"/>
-          <w:sz w:val="24"/>
-          <w:szCs w:val="24"/>
-        </w:rPr>
-        <w:t xml:space="preserve"> </w:t>
+        <w:t xml:space="preserve">No permitir que la identidad del sitio compita con los proyectos. </w:t>
       </w:r>
     </w:p>
     <w:p>
@@ -2584,7 +2568,6 @@
           <w:sz w:val="24"/>
           <w:szCs w:val="24"/>
         </w:rPr>
-        <w:lastRenderedPageBreak/>
         <w:t>No llenar todas las secciones de estrellas.</w:t>
       </w:r>
     </w:p>
@@ -2629,6 +2612,7 @@
           <w:sz w:val="24"/>
           <w:szCs w:val="24"/>
         </w:rPr>
+        <w:lastRenderedPageBreak/>
         <w:t>No abusar de sombras.</w:t>
       </w:r>
     </w:p>
@@ -2892,19 +2876,7 @@
         <w:rPr>
           <w:rFonts w:ascii="Calibri" w:hAnsi="Calibri" w:cs="Calibri"/>
         </w:rPr>
-        <w:t>Los títulos grandes deben reducir su tamaño progresivamente. El efecto de palabra en contorno detrás del título puede mantenerse, pero nunca debe provocar desbordamiento horizontal</w:t>
-      </w:r>
-      <w:r>
-        <w:rPr>
-          <w:rFonts w:ascii="Calibri" w:hAnsi="Calibri" w:cs="Calibri"/>
-        </w:rPr>
-        <w:t xml:space="preserve">, </w:t>
-      </w:r>
-      <w:r>
-        <w:rPr>
-          <w:rFonts w:ascii="Calibri" w:hAnsi="Calibri" w:cs="Calibri"/>
-        </w:rPr>
-        <w:t>En móvil, las interacciones que dependen de hover deben transformarse en información visible o activarse mediante toque.</w:t>
+        <w:t>Los títulos grandes deben reducir su tamaño progresivamente. En móvil, las interacciones que dependen de hover deben transformarse en información visible o activarse mediante toque.</w:t>
       </w:r>
     </w:p>
     <w:p>
@@ -4455,21 +4427,6 @@
 </file>
 
 <file path=customXml/item1.xml><?xml version="1.0" encoding="utf-8"?>
-<p:properties xmlns:p="http://schemas.microsoft.com/office/2006/metadata/properties" xmlns:xsi="http://www.w3.org/2001/XMLSchema-instance" xmlns:pc="http://schemas.microsoft.com/office/infopath/2007/PartnerControls">
-  <documentManagement/>
-</p:properties>
-</file>
-
-<file path=customXml/item2.xml><?xml version="1.0" encoding="utf-8"?>
-<?mso-contentType ?>
-<FormTemplates xmlns="http://schemas.microsoft.com/sharepoint/v3/contenttype/forms">
-  <Display>DocumentLibraryForm</Display>
-  <Edit>DocumentLibraryForm</Edit>
-  <New>DocumentLibraryForm</New>
-</FormTemplates>
-</file>
-
-<file path=customXml/item3.xml><?xml version="1.0" encoding="utf-8"?>
 <ct:contentTypeSchema xmlns:ct="http://schemas.microsoft.com/office/2006/metadata/contentType" xmlns:ma="http://schemas.microsoft.com/office/2006/metadata/properties/metaAttributes" ct:_="" ma:_="" ma:contentTypeName="Documento" ma:contentTypeID="0x010100E503066B13EA174F9B530B3A19D1DE7A" ma:contentTypeVersion="0" ma:contentTypeDescription="Crear nuevo documento." ma:contentTypeScope="" ma:versionID="89a93ff6e3c50a7663016e975c228036">
   <xsd:schema xmlns:xsd="http://www.w3.org/2001/XMLSchema" xmlns:xs="http://www.w3.org/2001/XMLSchema" xmlns:p="http://schemas.microsoft.com/office/2006/metadata/properties" targetNamespace="http://schemas.microsoft.com/office/2006/metadata/properties" ma:root="true" ma:fieldsID="26ff3a126252e742cc2543983a566b0e">
     <xsd:element name="properties">
@@ -4583,10 +4540,32 @@
 </ct:contentTypeSchema>
 </file>
 
+<file path=customXml/item2.xml><?xml version="1.0" encoding="utf-8"?>
+<?mso-contentType ?>
+<FormTemplates xmlns="http://schemas.microsoft.com/sharepoint/v3/contenttype/forms">
+  <Display>DocumentLibraryForm</Display>
+  <Edit>DocumentLibraryForm</Edit>
+  <New>DocumentLibraryForm</New>
+</FormTemplates>
+</file>
+
+<file path=customXml/item3.xml><?xml version="1.0" encoding="utf-8"?>
+<p:properties xmlns:p="http://schemas.microsoft.com/office/2006/metadata/properties" xmlns:xsi="http://www.w3.org/2001/XMLSchema-instance" xmlns:pc="http://schemas.microsoft.com/office/infopath/2007/PartnerControls">
+  <documentManagement/>
+</p:properties>
+</file>
+
 <file path=customXml/itemProps1.xml><?xml version="1.0" encoding="utf-8"?>
-<ds:datastoreItem xmlns:ds="http://schemas.openxmlformats.org/officeDocument/2006/customXml" ds:itemID="{6D6B11DE-903E-4BCD-A814-8DD52A30B088}">
+<ds:datastoreItem xmlns:ds="http://schemas.openxmlformats.org/officeDocument/2006/customXml" ds:itemID="{DDF49D9F-F2A1-4901-AF75-03E5ABC67E9E}">
   <ds:schemaRefs>
+    <ds:schemaRef ds:uri="http://schemas.microsoft.com/office/2006/metadata/contentType"/>
+    <ds:schemaRef ds:uri="http://schemas.microsoft.com/office/2006/metadata/properties/metaAttributes"/>
+    <ds:schemaRef ds:uri="http://www.w3.org/2001/XMLSchema"/>
     <ds:schemaRef ds:uri="http://schemas.microsoft.com/office/2006/metadata/properties"/>
+    <ds:schemaRef ds:uri="http://schemas.openxmlformats.org/package/2006/metadata/core-properties"/>
+    <ds:schemaRef ds:uri="http://purl.org/dc/elements/1.1/"/>
+    <ds:schemaRef ds:uri="http://purl.org/dc/terms/"/>
+    <ds:schemaRef ds:uri="http://schemas.microsoft.com/internal/obd"/>
     <ds:schemaRef ds:uri="http://schemas.microsoft.com/office/infopath/2007/PartnerControls"/>
   </ds:schemaRefs>
 </ds:datastoreItem>
@@ -4601,16 +4580,9 @@
 </file>
 
 <file path=customXml/itemProps3.xml><?xml version="1.0" encoding="utf-8"?>
-<ds:datastoreItem xmlns:ds="http://schemas.openxmlformats.org/officeDocument/2006/customXml" ds:itemID="{DDF49D9F-F2A1-4901-AF75-03E5ABC67E9E}">
+<ds:datastoreItem xmlns:ds="http://schemas.openxmlformats.org/officeDocument/2006/customXml" ds:itemID="{6D6B11DE-903E-4BCD-A814-8DD52A30B088}">
   <ds:schemaRefs>
-    <ds:schemaRef ds:uri="http://schemas.microsoft.com/office/2006/metadata/contentType"/>
-    <ds:schemaRef ds:uri="http://schemas.microsoft.com/office/2006/metadata/properties/metaAttributes"/>
-    <ds:schemaRef ds:uri="http://www.w3.org/2001/XMLSchema"/>
     <ds:schemaRef ds:uri="http://schemas.microsoft.com/office/2006/metadata/properties"/>
-    <ds:schemaRef ds:uri="http://schemas.openxmlformats.org/package/2006/metadata/core-properties"/>
-    <ds:schemaRef ds:uri="http://purl.org/dc/elements/1.1/"/>
-    <ds:schemaRef ds:uri="http://purl.org/dc/terms/"/>
-    <ds:schemaRef ds:uri="http://schemas.microsoft.com/internal/obd"/>
     <ds:schemaRef ds:uri="http://schemas.microsoft.com/office/infopath/2007/PartnerControls"/>
   </ds:schemaRefs>
 </ds:datastoreItem>

</xml_diff>